<commit_message>
Cuentos de Peonita para quien no ve: ejercicios con las manos y EPUB
Cada ejercicio de las versiones para quien no ve (accesible, PDF, Word y
EPUB) dice qué armar en un tablero táctil y qué tocar, sin la casilla
amarilla, la estrella ni «marca» o «pinta»: la estrella es una ficha. Las
soluciones y los diagramas del cuento, igual, y una página para el adulto
sobre cómo leerlo con las manos.

El libro también en EPUB 3 accesible: una página por parte, índice,
es-CR, metadatos de EPUB Accessibility 1.1 e imágenes decorativas. Los
tres pasan EPUBCheck 5.4.0 y Ace by DAISY sin problemas; los PDF siguen
cumpliendo PDF/UA-1 y los Word validan. verificar-libro-ninos.js lo
comprueba.

Co-Authored-By: Claude Opus 5.5 <noreply@anthropic.com>
Claude-Session: https://claude.ai/code/session_01Fu5zyMdRrftAZKkQhA4hW8
</commit_message>
<xml_diff>
--- a/material/peonita-rey/peonita-rey-adaptado.docx
+++ b/material/peonita-rey/peonita-rey-adaptado.docx
@@ -54,7 +54,7 @@
         <w:t xml:space="preserve">Versión adaptada. </w:t>
       </w:r>
       <w:r>
-        <w:t xml:space="preserve">Es el mismo libro, hecho para quien ve poco o no ve: letra grande, negro sobre blanco, un tablero grande en cada página y todo escrito, para leerlo con lupa o con lector de pantalla. Cada dibujo va contado en palabras y cada posición, pieza por pieza.</w:t>
+        <w:t xml:space="preserve">Es el mismo libro, hecho para quien ve poco o no ve: letra grande, negro sobre blanco, un tablero grande en cada página y todo escrito, para leerlo con lupa o con lector de pantalla. Cada dibujo va contado en palabras y cada posición, pieza por pieza, y cada ejercicio dice cómo hacerlo con las manos en un tablero táctil.</w:t>
       </w:r>
     </w:p>
     <w:p>
@@ -294,6 +294,17 @@
     </w:p>
     <w:p>
       <w:pPr>
+        <w:pStyle w:val="Heading2"/>
+        <w:keepNext/>
+        <w:keepLines/>
+        <w:pageBreakBefore/>
+      </w:pPr>
+      <w:r>
+        <w:t xml:space="preserve">Para leer con las manos</w:t>
+      </w:r>
+    </w:p>
+    <w:p>
+      <w:pPr>
         <w:keepLines/>
       </w:pPr>
       <w:r>
@@ -301,7 +312,67 @@
           <w:b w:val="false"/>
           <w:bCs w:val="false"/>
         </w:rPr>
-        <w:t xml:space="preserve">Oscar Angulo Cubero</w:t>
+        <w:t xml:space="preserve">Este libro se puede leer con un niño o una niña que no ve. Los ejercicios se hacen con las manos, en un tablero de ajedrez táctil, y se contestan en voz alta: usted lee, el niño arma, toca y responde.</w:t>
+      </w:r>
+    </w:p>
+    <w:p>
+      <w:pPr>
+        <w:keepLines/>
+      </w:pPr>
+      <w:r>
+        <w:rPr>
+          <w:b w:val="false"/>
+          <w:bCs w:val="false"/>
+        </w:rPr>
+        <w:t xml:space="preserve">En la mayoría de los tableros táctiles, las casillas oscuras son más altas que las claras, y cada pieza entra en un agujero para que no se caiga al tocarla. Las piezas negras tienen una puntita o un clavito arriba; así se distinguen de las blancas.</w:t>
+      </w:r>
+    </w:p>
+    <w:p>
+      <w:pPr>
+        <w:keepLines/>
+      </w:pPr>
+      <w:r>
+        <w:rPr>
+          <w:b w:val="false"/>
+          <w:bCs w:val="false"/>
+        </w:rPr>
+        <w:t xml:space="preserve">Tenga a mano unos botones o monedas: son las «fichas». Donde el libro con dibujos tiene una estrella, usted pone una ficha en esa casilla.</w:t>
+      </w:r>
+    </w:p>
+    <w:p>
+      <w:pPr>
+        <w:keepLines/>
+      </w:pPr>
+      <w:r>
+        <w:rPr>
+          <w:b w:val="false"/>
+          <w:bCs w:val="false"/>
+        </w:rPr>
+        <w:t xml:space="preserve">Cada ejercicio empieza con «Con las manos»: qué piezas poner y qué tocar. La posición viene escrita pieza por pieza: primero las blancas y después las negras. Arme la posición con el niño, no por él: buscar la casilla también es aprender.</w:t>
+      </w:r>
+    </w:p>
+    <w:p>
+      <w:pPr>
+        <w:keepLines/>
+      </w:pPr>
+      <w:r>
+        <w:rPr>
+          <w:b w:val="false"/>
+          <w:bCs w:val="false"/>
+        </w:rPr>
+        <w:t xml:space="preserve">Las casillas se nombran con una letra y un número: la letra dice la columna, contando desde la izquierda (a, b, c… hasta h), y el número dice la fila, contando desde abajo (1 hasta 8). El niño se sienta del lado de las piezas blancas.</w:t>
+      </w:r>
+    </w:p>
+    <w:p>
+      <w:pPr>
+        <w:keepLines/>
+      </w:pPr>
+      <w:r>
+        <w:rPr>
+          <w:b w:val="false"/>
+          <w:bCs w:val="false"/>
+        </w:rPr>
+        <w:t xml:space="preserve">Antes de empezar, recorran juntos el tablero: las orillas, las cuatro esquinas, una fila de izquierda a derecha y una columna de abajo hacia arriba.</w:t>
       </w:r>
     </w:p>
     <w:p>
@@ -689,7 +760,7 @@
       <w:r>
         <w:drawing>
           <wp:inline distT="0" distB="0" distL="0" distR="0">
-            <wp:extent cx="5399931" cy="5399931"/>
+            <wp:extent cx="4319885" cy="4319885"/>
             <wp:effectExtent t="0" r="0" b="0" l="0"/>
             <wp:docPr id="1" name="Dibujo decorativo" descr="" title="">
               <a:extLst xmlns:a="http://schemas.openxmlformats.org/drawingml/2006/main">
@@ -720,7 +791,7 @@
                   <pic:spPr bwMode="auto">
                     <a:xfrm>
                       <a:off x="0" y="0"/>
-                      <a:ext cx="5399931" cy="5399931"/>
+                      <a:ext cx="4319885" cy="4319885"/>
                     </a:xfrm>
                     <a:prstGeom prst="rect">
                       <a:avLst/>
@@ -748,6 +819,7 @@
     </w:p>
     <w:p>
       <w:pPr>
+        <w:keepNext/>
         <w:keepLines/>
         <w:pBdr>
           <w:top w:val="single" w:color="000000" w:sz="12" w:space="6"/>
@@ -764,7 +836,28 @@
         <w:t xml:space="preserve">La posición. </w:t>
       </w:r>
       <w:r>
-        <w:t xml:space="preserve">Piezas blancas: rey en e6; torre en a8. Piezas negras: rey en e8. La flecha va de a8 a e8.</w:t>
+        <w:t xml:space="preserve">Piezas blancas: rey en e6; torre en a8. Piezas negras: rey en e8.</w:t>
+      </w:r>
+    </w:p>
+    <w:p>
+      <w:pPr>
+        <w:keepLines/>
+        <w:pBdr>
+          <w:top w:val="single" w:color="000000" w:sz="12" w:space="6"/>
+          <w:left w:val="single" w:color="000000" w:sz="12" w:space="6"/>
+          <w:bottom w:val="single" w:color="000000" w:sz="12" w:space="6"/>
+          <w:right w:val="single" w:color="000000" w:sz="12" w:space="6"/>
+        </w:pBdr>
+      </w:pPr>
+      <w:r>
+        <w:rPr>
+          <w:b/>
+          <w:bCs/>
+        </w:rPr>
+        <w:t xml:space="preserve">Con las manos. </w:t>
+      </w:r>
+      <w:r>
+        <w:t xml:space="preserve">Arma esta posición en tu tablero. Con el dedo, sigue el camino de a8 a e8.</w:t>
       </w:r>
     </w:p>
     <w:p>
@@ -848,7 +941,7 @@
       <w:r>
         <w:drawing>
           <wp:inline distT="0" distB="0" distL="0" distR="0">
-            <wp:extent cx="3887986" cy="3887986"/>
+            <wp:extent cx="3239988" cy="3239988"/>
             <wp:effectExtent t="0" r="0" b="0" l="0"/>
             <wp:docPr id="1" name="Dibujo decorativo" descr="" title="">
               <a:extLst xmlns:a="http://schemas.openxmlformats.org/drawingml/2006/main">
@@ -879,7 +972,7 @@
                   <pic:spPr bwMode="auto">
                     <a:xfrm>
                       <a:off x="0" y="0"/>
-                      <a:ext cx="3887986" cy="3887986"/>
+                      <a:ext cx="3239988" cy="3239988"/>
                     </a:xfrm>
                     <a:prstGeom prst="rect">
                       <a:avLst/>
@@ -918,6 +1011,28 @@
       <w:pPr>
         <w:keepNext/>
         <w:keepLines/>
+        <w:pBdr>
+          <w:top w:val="single" w:color="000000" w:sz="12" w:space="6"/>
+          <w:left w:val="single" w:color="000000" w:sz="12" w:space="6"/>
+          <w:bottom w:val="single" w:color="000000" w:sz="12" w:space="6"/>
+          <w:right w:val="single" w:color="000000" w:sz="12" w:space="6"/>
+        </w:pBdr>
+      </w:pPr>
+      <w:r>
+        <w:rPr>
+          <w:b/>
+          <w:bCs/>
+        </w:rPr>
+        <w:t xml:space="preserve">Con las manos. </w:t>
+      </w:r>
+      <w:r>
+        <w:t xml:space="preserve">Arma esta posición en tu tablero. Sigue con el dedo los caminos de cada pieza negra, una por una, y fíjate si alguna llega al rey blanco.</w:t>
+      </w:r>
+    </w:p>
+    <w:p>
+      <w:pPr>
+        <w:keepNext/>
+        <w:keepLines/>
       </w:pPr>
       <w:r>
         <w:rPr>
@@ -965,7 +1080,7 @@
       <w:r>
         <w:drawing>
           <wp:inline distT="0" distB="0" distL="0" distR="0">
-            <wp:extent cx="3887986" cy="3887986"/>
+            <wp:extent cx="3239988" cy="3239988"/>
             <wp:effectExtent t="0" r="0" b="0" l="0"/>
             <wp:docPr id="1" name="Dibujo decorativo" descr="" title="">
               <a:extLst xmlns:a="http://schemas.openxmlformats.org/drawingml/2006/main">
@@ -996,7 +1111,7 @@
                   <pic:spPr bwMode="auto">
                     <a:xfrm>
                       <a:off x="0" y="0"/>
-                      <a:ext cx="3887986" cy="3887986"/>
+                      <a:ext cx="3239988" cy="3239988"/>
                     </a:xfrm>
                     <a:prstGeom prst="rect">
                       <a:avLst/>
@@ -1035,13 +1150,35 @@
       <w:pPr>
         <w:keepNext/>
         <w:keepLines/>
-      </w:pPr>
-      <w:r>
-        <w:rPr>
-          <w:b/>
-          <w:bCs/>
-        </w:rPr>
-        <w:t xml:space="preserve">Le toca mover al rey negro. ¿Qué pasó? ¿Jaque mate, ahogado o ninguno?</w:t>
+        <w:pBdr>
+          <w:top w:val="single" w:color="000000" w:sz="12" w:space="6"/>
+          <w:left w:val="single" w:color="000000" w:sz="12" w:space="6"/>
+          <w:bottom w:val="single" w:color="000000" w:sz="12" w:space="6"/>
+          <w:right w:val="single" w:color="000000" w:sz="12" w:space="6"/>
+        </w:pBdr>
+      </w:pPr>
+      <w:r>
+        <w:rPr>
+          <w:b/>
+          <w:bCs/>
+        </w:rPr>
+        <w:t xml:space="preserve">Con las manos. </w:t>
+      </w:r>
+      <w:r>
+        <w:t xml:space="preserve">Arma esta posición en tu tablero. Toca, una por una, las casillas de alrededor del rey negro. Para cada una, busca si alguna pieza blanca llega hasta ahí.</w:t>
+      </w:r>
+    </w:p>
+    <w:p>
+      <w:pPr>
+        <w:keepNext/>
+        <w:keepLines/>
+      </w:pPr>
+      <w:r>
+        <w:rPr>
+          <w:b/>
+          <w:bCs/>
+        </w:rPr>
+        <w:t xml:space="preserve">Le toca mover al rey negro. ¿Qué pasó: jaque mate, ahogado o ninguno?</w:t>
       </w:r>
     </w:p>
     <w:p>
@@ -1082,7 +1219,7 @@
       <w:r>
         <w:drawing>
           <wp:inline distT="0" distB="0" distL="0" distR="0">
-            <wp:extent cx="3887986" cy="3887986"/>
+            <wp:extent cx="3239988" cy="3239988"/>
             <wp:effectExtent t="0" r="0" b="0" l="0"/>
             <wp:docPr id="1" name="Dibujo decorativo" descr="" title="">
               <a:extLst xmlns:a="http://schemas.openxmlformats.org/drawingml/2006/main">
@@ -1113,7 +1250,7 @@
                   <pic:spPr bwMode="auto">
                     <a:xfrm>
                       <a:off x="0" y="0"/>
-                      <a:ext cx="3887986" cy="3887986"/>
+                      <a:ext cx="3239988" cy="3239988"/>
                     </a:xfrm>
                     <a:prstGeom prst="rect">
                       <a:avLst/>
@@ -1152,13 +1289,35 @@
       <w:pPr>
         <w:keepNext/>
         <w:keepLines/>
-      </w:pPr>
-      <w:r>
-        <w:rPr>
-          <w:b/>
-          <w:bCs/>
-        </w:rPr>
-        <w:t xml:space="preserve">Le toca mover al rey negro. ¿Qué pasó? ¿Jaque mate, ahogado o ninguno?</w:t>
+        <w:pBdr>
+          <w:top w:val="single" w:color="000000" w:sz="12" w:space="6"/>
+          <w:left w:val="single" w:color="000000" w:sz="12" w:space="6"/>
+          <w:bottom w:val="single" w:color="000000" w:sz="12" w:space="6"/>
+          <w:right w:val="single" w:color="000000" w:sz="12" w:space="6"/>
+        </w:pBdr>
+      </w:pPr>
+      <w:r>
+        <w:rPr>
+          <w:b/>
+          <w:bCs/>
+        </w:rPr>
+        <w:t xml:space="preserve">Con las manos. </w:t>
+      </w:r>
+      <w:r>
+        <w:t xml:space="preserve">Arma esta posición en tu tablero. Toca, una por una, las casillas de alrededor del rey negro. Para cada una, busca si alguna pieza blanca llega hasta ahí.</w:t>
+      </w:r>
+    </w:p>
+    <w:p>
+      <w:pPr>
+        <w:keepNext/>
+        <w:keepLines/>
+      </w:pPr>
+      <w:r>
+        <w:rPr>
+          <w:b/>
+          <w:bCs/>
+        </w:rPr>
+        <w:t xml:space="preserve">Le toca mover al rey negro. ¿Qué pasó: jaque mate, ahogado o ninguno?</w:t>
       </w:r>
     </w:p>
     <w:p>
@@ -1199,7 +1358,7 @@
       <w:r>
         <w:drawing>
           <wp:inline distT="0" distB="0" distL="0" distR="0">
-            <wp:extent cx="3887986" cy="3887986"/>
+            <wp:extent cx="3239988" cy="3239988"/>
             <wp:effectExtent t="0" r="0" b="0" l="0"/>
             <wp:docPr id="1" name="Dibujo decorativo" descr="" title="">
               <a:extLst xmlns:a="http://schemas.openxmlformats.org/drawingml/2006/main">
@@ -1230,7 +1389,7 @@
                   <pic:spPr bwMode="auto">
                     <a:xfrm>
                       <a:off x="0" y="0"/>
-                      <a:ext cx="3887986" cy="3887986"/>
+                      <a:ext cx="3239988" cy="3239988"/>
                     </a:xfrm>
                     <a:prstGeom prst="rect">
                       <a:avLst/>
@@ -1263,6 +1422,28 @@
       </w:r>
       <w:r>
         <w:t xml:space="preserve">Piezas blancas: rey en g6; torre en a1. Piezas negras: rey en h8.</w:t>
+      </w:r>
+    </w:p>
+    <w:p>
+      <w:pPr>
+        <w:keepNext/>
+        <w:keepLines/>
+        <w:pBdr>
+          <w:top w:val="single" w:color="000000" w:sz="12" w:space="6"/>
+          <w:left w:val="single" w:color="000000" w:sz="12" w:space="6"/>
+          <w:bottom w:val="single" w:color="000000" w:sz="12" w:space="6"/>
+          <w:right w:val="single" w:color="000000" w:sz="12" w:space="6"/>
+        </w:pBdr>
+      </w:pPr>
+      <w:r>
+        <w:rPr>
+          <w:b/>
+          <w:bCs/>
+        </w:rPr>
+        <w:t xml:space="preserve">Con las manos. </w:t>
+      </w:r>
+      <w:r>
+        <w:t xml:space="preserve">Arma esta posición en tu tablero. Prueba con tus piezas las jugadas de las blancas. Después de cada una, toca las casillas de alrededor del rey negro: ¿puede escapar a alguna?</w:t>
       </w:r>
     </w:p>
     <w:p>
@@ -1485,7 +1666,7 @@
       <w:r>
         <w:drawing>
           <wp:inline distT="0" distB="0" distL="0" distR="0">
-            <wp:extent cx="5399931" cy="5399931"/>
+            <wp:extent cx="4319885" cy="4319885"/>
             <wp:effectExtent t="0" r="0" b="0" l="0"/>
             <wp:docPr id="1" name="Dibujo decorativo" descr="" title="">
               <a:extLst xmlns:a="http://schemas.openxmlformats.org/drawingml/2006/main">
@@ -1516,7 +1697,7 @@
                   <pic:spPr bwMode="auto">
                     <a:xfrm>
                       <a:off x="0" y="0"/>
-                      <a:ext cx="5399931" cy="5399931"/>
+                      <a:ext cx="4319885" cy="4319885"/>
                     </a:xfrm>
                     <a:prstGeom prst="rect">
                       <a:avLst/>
@@ -1544,6 +1725,7 @@
     </w:p>
     <w:p>
       <w:pPr>
+        <w:keepNext/>
         <w:keepLines/>
         <w:pBdr>
           <w:top w:val="single" w:color="000000" w:sz="12" w:space="6"/>
@@ -1560,7 +1742,28 @@
         <w:t xml:space="preserve">La posición. </w:t>
       </w:r>
       <w:r>
-        <w:t xml:space="preserve">Piezas blancas: rey en e6; torre en a1. Piezas negras: rey en e8. La flecha va de a1 a a8.</w:t>
+        <w:t xml:space="preserve">Piezas blancas: rey en e6; torre en a1. Piezas negras: rey en e8.</w:t>
+      </w:r>
+    </w:p>
+    <w:p>
+      <w:pPr>
+        <w:keepLines/>
+        <w:pBdr>
+          <w:top w:val="single" w:color="000000" w:sz="12" w:space="6"/>
+          <w:left w:val="single" w:color="000000" w:sz="12" w:space="6"/>
+          <w:bottom w:val="single" w:color="000000" w:sz="12" w:space="6"/>
+          <w:right w:val="single" w:color="000000" w:sz="12" w:space="6"/>
+        </w:pBdr>
+      </w:pPr>
+      <w:r>
+        <w:rPr>
+          <w:b/>
+          <w:bCs/>
+        </w:rPr>
+        <w:t xml:space="preserve">Con las manos. </w:t>
+      </w:r>
+      <w:r>
+        <w:t xml:space="preserve">Arma esta posición en tu tablero. Con el dedo, sigue el camino de a1 a a8.</w:t>
       </w:r>
     </w:p>
     <w:p>
@@ -1644,7 +1847,7 @@
       <w:r>
         <w:drawing>
           <wp:inline distT="0" distB="0" distL="0" distR="0">
-            <wp:extent cx="3887986" cy="3887986"/>
+            <wp:extent cx="3239988" cy="3239988"/>
             <wp:effectExtent t="0" r="0" b="0" l="0"/>
             <wp:docPr id="1" name="Dibujo decorativo" descr="" title="">
               <a:extLst xmlns:a="http://schemas.openxmlformats.org/drawingml/2006/main">
@@ -1675,7 +1878,7 @@
                   <pic:spPr bwMode="auto">
                     <a:xfrm>
                       <a:off x="0" y="0"/>
-                      <a:ext cx="3887986" cy="3887986"/>
+                      <a:ext cx="3239988" cy="3239988"/>
                     </a:xfrm>
                     <a:prstGeom prst="rect">
                       <a:avLst/>
@@ -1714,6 +1917,28 @@
       <w:pPr>
         <w:keepNext/>
         <w:keepLines/>
+        <w:pBdr>
+          <w:top w:val="single" w:color="000000" w:sz="12" w:space="6"/>
+          <w:left w:val="single" w:color="000000" w:sz="12" w:space="6"/>
+          <w:bottom w:val="single" w:color="000000" w:sz="12" w:space="6"/>
+          <w:right w:val="single" w:color="000000" w:sz="12" w:space="6"/>
+        </w:pBdr>
+      </w:pPr>
+      <w:r>
+        <w:rPr>
+          <w:b/>
+          <w:bCs/>
+        </w:rPr>
+        <w:t xml:space="preserve">Con las manos. </w:t>
+      </w:r>
+      <w:r>
+        <w:t xml:space="preserve">Arma esta posición en tu tablero. Prueba con tus piezas las jugadas de las blancas. Después de cada una, toca las casillas de alrededor del rey negro: ¿puede escapar a alguna?</w:t>
+      </w:r>
+    </w:p>
+    <w:p>
+      <w:pPr>
+        <w:keepNext/>
+        <w:keepLines/>
       </w:pPr>
       <w:r>
         <w:rPr>
@@ -1761,7 +1986,7 @@
       <w:r>
         <w:drawing>
           <wp:inline distT="0" distB="0" distL="0" distR="0">
-            <wp:extent cx="3887986" cy="3887986"/>
+            <wp:extent cx="3239988" cy="3239988"/>
             <wp:effectExtent t="0" r="0" b="0" l="0"/>
             <wp:docPr id="1" name="Dibujo decorativo" descr="" title="">
               <a:extLst xmlns:a="http://schemas.openxmlformats.org/drawingml/2006/main">
@@ -1792,7 +2017,7 @@
                   <pic:spPr bwMode="auto">
                     <a:xfrm>
                       <a:off x="0" y="0"/>
-                      <a:ext cx="3887986" cy="3887986"/>
+                      <a:ext cx="3239988" cy="3239988"/>
                     </a:xfrm>
                     <a:prstGeom prst="rect">
                       <a:avLst/>
@@ -1831,6 +2056,28 @@
       <w:pPr>
         <w:keepNext/>
         <w:keepLines/>
+        <w:pBdr>
+          <w:top w:val="single" w:color="000000" w:sz="12" w:space="6"/>
+          <w:left w:val="single" w:color="000000" w:sz="12" w:space="6"/>
+          <w:bottom w:val="single" w:color="000000" w:sz="12" w:space="6"/>
+          <w:right w:val="single" w:color="000000" w:sz="12" w:space="6"/>
+        </w:pBdr>
+      </w:pPr>
+      <w:r>
+        <w:rPr>
+          <w:b/>
+          <w:bCs/>
+        </w:rPr>
+        <w:t xml:space="preserve">Con las manos. </w:t>
+      </w:r>
+      <w:r>
+        <w:t xml:space="preserve">Arma esta posición en tu tablero. Prueba con tus piezas las jugadas de las blancas. Después de cada una, toca las casillas de alrededor del rey negro: ¿puede escapar a alguna?</w:t>
+      </w:r>
+    </w:p>
+    <w:p>
+      <w:pPr>
+        <w:keepNext/>
+        <w:keepLines/>
       </w:pPr>
       <w:r>
         <w:rPr>
@@ -1878,7 +2125,7 @@
       <w:r>
         <w:drawing>
           <wp:inline distT="0" distB="0" distL="0" distR="0">
-            <wp:extent cx="3887986" cy="3887986"/>
+            <wp:extent cx="3239988" cy="3239988"/>
             <wp:effectExtent t="0" r="0" b="0" l="0"/>
             <wp:docPr id="1" name="Dibujo decorativo" descr="" title="">
               <a:extLst xmlns:a="http://schemas.openxmlformats.org/drawingml/2006/main">
@@ -1909,7 +2156,7 @@
                   <pic:spPr bwMode="auto">
                     <a:xfrm>
                       <a:off x="0" y="0"/>
-                      <a:ext cx="3887986" cy="3887986"/>
+                      <a:ext cx="3239988" cy="3239988"/>
                     </a:xfrm>
                     <a:prstGeom prst="rect">
                       <a:avLst/>
@@ -1948,6 +2195,28 @@
       <w:pPr>
         <w:keepNext/>
         <w:keepLines/>
+        <w:pBdr>
+          <w:top w:val="single" w:color="000000" w:sz="12" w:space="6"/>
+          <w:left w:val="single" w:color="000000" w:sz="12" w:space="6"/>
+          <w:bottom w:val="single" w:color="000000" w:sz="12" w:space="6"/>
+          <w:right w:val="single" w:color="000000" w:sz="12" w:space="6"/>
+        </w:pBdr>
+      </w:pPr>
+      <w:r>
+        <w:rPr>
+          <w:b/>
+          <w:bCs/>
+        </w:rPr>
+        <w:t xml:space="preserve">Con las manos. </w:t>
+      </w:r>
+      <w:r>
+        <w:t xml:space="preserve">Arma esta posición en tu tablero. Prueba con tus piezas las jugadas de las blancas. Después de cada una, toca las casillas de alrededor del rey negro: ¿puede escapar a alguna?</w:t>
+      </w:r>
+    </w:p>
+    <w:p>
+      <w:pPr>
+        <w:keepNext/>
+        <w:keepLines/>
       </w:pPr>
       <w:r>
         <w:rPr>
@@ -1995,7 +2264,7 @@
       <w:r>
         <w:drawing>
           <wp:inline distT="0" distB="0" distL="0" distR="0">
-            <wp:extent cx="3887986" cy="3887986"/>
+            <wp:extent cx="3239988" cy="3239988"/>
             <wp:effectExtent t="0" r="0" b="0" l="0"/>
             <wp:docPr id="1" name="Dibujo decorativo" descr="" title="">
               <a:extLst xmlns:a="http://schemas.openxmlformats.org/drawingml/2006/main">
@@ -2026,7 +2295,7 @@
                   <pic:spPr bwMode="auto">
                     <a:xfrm>
                       <a:off x="0" y="0"/>
-                      <a:ext cx="3887986" cy="3887986"/>
+                      <a:ext cx="3239988" cy="3239988"/>
                     </a:xfrm>
                     <a:prstGeom prst="rect">
                       <a:avLst/>
@@ -2065,13 +2334,35 @@
       <w:pPr>
         <w:keepNext/>
         <w:keepLines/>
-      </w:pPr>
-      <w:r>
-        <w:rPr>
-          <w:b/>
-          <w:bCs/>
-        </w:rPr>
-        <w:t xml:space="preserve">Le toca mover al rey negro. ¿Qué pasó? ¿Jaque mate, ahogado o ninguno?</w:t>
+        <w:pBdr>
+          <w:top w:val="single" w:color="000000" w:sz="12" w:space="6"/>
+          <w:left w:val="single" w:color="000000" w:sz="12" w:space="6"/>
+          <w:bottom w:val="single" w:color="000000" w:sz="12" w:space="6"/>
+          <w:right w:val="single" w:color="000000" w:sz="12" w:space="6"/>
+        </w:pBdr>
+      </w:pPr>
+      <w:r>
+        <w:rPr>
+          <w:b/>
+          <w:bCs/>
+        </w:rPr>
+        <w:t xml:space="preserve">Con las manos. </w:t>
+      </w:r>
+      <w:r>
+        <w:t xml:space="preserve">Arma esta posición en tu tablero. Toca, una por una, las casillas de alrededor del rey negro. Para cada una, busca si alguna pieza blanca llega hasta ahí.</w:t>
+      </w:r>
+    </w:p>
+    <w:p>
+      <w:pPr>
+        <w:keepNext/>
+        <w:keepLines/>
+      </w:pPr>
+      <w:r>
+        <w:rPr>
+          <w:b/>
+          <w:bCs/>
+        </w:rPr>
+        <w:t xml:space="preserve">Le toca mover al rey negro. ¿Qué pasó: jaque mate, ahogado o ninguno?</w:t>
       </w:r>
     </w:p>
     <w:p>
@@ -2293,7 +2584,7 @@
       <w:r>
         <w:drawing>
           <wp:inline distT="0" distB="0" distL="0" distR="0">
-            <wp:extent cx="5399931" cy="5399931"/>
+            <wp:extent cx="4319885" cy="4319885"/>
             <wp:effectExtent t="0" r="0" b="0" l="0"/>
             <wp:docPr id="1" name="Dibujo decorativo" descr="" title="">
               <a:extLst xmlns:a="http://schemas.openxmlformats.org/drawingml/2006/main">
@@ -2324,7 +2615,7 @@
                   <pic:spPr bwMode="auto">
                     <a:xfrm>
                       <a:off x="0" y="0"/>
-                      <a:ext cx="5399931" cy="5399931"/>
+                      <a:ext cx="4319885" cy="4319885"/>
                     </a:xfrm>
                     <a:prstGeom prst="rect">
                       <a:avLst/>
@@ -2352,6 +2643,7 @@
     </w:p>
     <w:p>
       <w:pPr>
+        <w:keepNext/>
         <w:keepLines/>
         <w:pBdr>
           <w:top w:val="single" w:color="000000" w:sz="12" w:space="6"/>
@@ -2368,7 +2660,28 @@
         <w:t xml:space="preserve">La posición. </w:t>
       </w:r>
       <w:r>
-        <w:t xml:space="preserve">Piezas blancas: rey en g1; torres en a7, b1. Piezas negras: rey en g8. La flecha va de b1 a b8.</w:t>
+        <w:t xml:space="preserve">Piezas blancas: rey en g1; torres en a7, b1. Piezas negras: rey en g8.</w:t>
+      </w:r>
+    </w:p>
+    <w:p>
+      <w:pPr>
+        <w:keepLines/>
+        <w:pBdr>
+          <w:top w:val="single" w:color="000000" w:sz="12" w:space="6"/>
+          <w:left w:val="single" w:color="000000" w:sz="12" w:space="6"/>
+          <w:bottom w:val="single" w:color="000000" w:sz="12" w:space="6"/>
+          <w:right w:val="single" w:color="000000" w:sz="12" w:space="6"/>
+        </w:pBdr>
+      </w:pPr>
+      <w:r>
+        <w:rPr>
+          <w:b/>
+          <w:bCs/>
+        </w:rPr>
+        <w:t xml:space="preserve">Con las manos. </w:t>
+      </w:r>
+      <w:r>
+        <w:t xml:space="preserve">Arma esta posición en tu tablero. Con el dedo, sigue el camino de b1 a b8.</w:t>
       </w:r>
     </w:p>
     <w:p>
@@ -2452,7 +2765,7 @@
       <w:r>
         <w:drawing>
           <wp:inline distT="0" distB="0" distL="0" distR="0">
-            <wp:extent cx="3887986" cy="3887986"/>
+            <wp:extent cx="3239988" cy="3239988"/>
             <wp:effectExtent t="0" r="0" b="0" l="0"/>
             <wp:docPr id="1" name="Dibujo decorativo" descr="" title="">
               <a:extLst xmlns:a="http://schemas.openxmlformats.org/drawingml/2006/main">
@@ -2483,7 +2796,7 @@
                   <pic:spPr bwMode="auto">
                     <a:xfrm>
                       <a:off x="0" y="0"/>
-                      <a:ext cx="3887986" cy="3887986"/>
+                      <a:ext cx="3239988" cy="3239988"/>
                     </a:xfrm>
                     <a:prstGeom prst="rect">
                       <a:avLst/>
@@ -2522,6 +2835,28 @@
       <w:pPr>
         <w:keepNext/>
         <w:keepLines/>
+        <w:pBdr>
+          <w:top w:val="single" w:color="000000" w:sz="12" w:space="6"/>
+          <w:left w:val="single" w:color="000000" w:sz="12" w:space="6"/>
+          <w:bottom w:val="single" w:color="000000" w:sz="12" w:space="6"/>
+          <w:right w:val="single" w:color="000000" w:sz="12" w:space="6"/>
+        </w:pBdr>
+      </w:pPr>
+      <w:r>
+        <w:rPr>
+          <w:b/>
+          <w:bCs/>
+        </w:rPr>
+        <w:t xml:space="preserve">Con las manos. </w:t>
+      </w:r>
+      <w:r>
+        <w:t xml:space="preserve">Arma esta posición en tu tablero. Prueba con tus piezas las jugadas de las blancas. Después de cada una, toca las casillas de alrededor del rey negro: ¿puede escapar a alguna?</w:t>
+      </w:r>
+    </w:p>
+    <w:p>
+      <w:pPr>
+        <w:keepNext/>
+        <w:keepLines/>
       </w:pPr>
       <w:r>
         <w:rPr>
@@ -2569,7 +2904,7 @@
       <w:r>
         <w:drawing>
           <wp:inline distT="0" distB="0" distL="0" distR="0">
-            <wp:extent cx="3887986" cy="3887986"/>
+            <wp:extent cx="3239988" cy="3239988"/>
             <wp:effectExtent t="0" r="0" b="0" l="0"/>
             <wp:docPr id="1" name="Dibujo decorativo" descr="" title="">
               <a:extLst xmlns:a="http://schemas.openxmlformats.org/drawingml/2006/main">
@@ -2600,7 +2935,7 @@
                   <pic:spPr bwMode="auto">
                     <a:xfrm>
                       <a:off x="0" y="0"/>
-                      <a:ext cx="3887986" cy="3887986"/>
+                      <a:ext cx="3239988" cy="3239988"/>
                     </a:xfrm>
                     <a:prstGeom prst="rect">
                       <a:avLst/>
@@ -2639,6 +2974,28 @@
       <w:pPr>
         <w:keepNext/>
         <w:keepLines/>
+        <w:pBdr>
+          <w:top w:val="single" w:color="000000" w:sz="12" w:space="6"/>
+          <w:left w:val="single" w:color="000000" w:sz="12" w:space="6"/>
+          <w:bottom w:val="single" w:color="000000" w:sz="12" w:space="6"/>
+          <w:right w:val="single" w:color="000000" w:sz="12" w:space="6"/>
+        </w:pBdr>
+      </w:pPr>
+      <w:r>
+        <w:rPr>
+          <w:b/>
+          <w:bCs/>
+        </w:rPr>
+        <w:t xml:space="preserve">Con las manos. </w:t>
+      </w:r>
+      <w:r>
+        <w:t xml:space="preserve">Arma esta posición en tu tablero. Prueba con tus piezas las jugadas de las blancas. Después de cada una, toca las casillas de alrededor del rey negro: ¿puede escapar a alguna?</w:t>
+      </w:r>
+    </w:p>
+    <w:p>
+      <w:pPr>
+        <w:keepNext/>
+        <w:keepLines/>
       </w:pPr>
       <w:r>
         <w:rPr>
@@ -2686,7 +3043,7 @@
       <w:r>
         <w:drawing>
           <wp:inline distT="0" distB="0" distL="0" distR="0">
-            <wp:extent cx="3887986" cy="3887986"/>
+            <wp:extent cx="3239988" cy="3239988"/>
             <wp:effectExtent t="0" r="0" b="0" l="0"/>
             <wp:docPr id="1" name="Dibujo decorativo" descr="" title="">
               <a:extLst xmlns:a="http://schemas.openxmlformats.org/drawingml/2006/main">
@@ -2717,7 +3074,7 @@
                   <pic:spPr bwMode="auto">
                     <a:xfrm>
                       <a:off x="0" y="0"/>
-                      <a:ext cx="3887986" cy="3887986"/>
+                      <a:ext cx="3239988" cy="3239988"/>
                     </a:xfrm>
                     <a:prstGeom prst="rect">
                       <a:avLst/>
@@ -2756,6 +3113,28 @@
       <w:pPr>
         <w:keepNext/>
         <w:keepLines/>
+        <w:pBdr>
+          <w:top w:val="single" w:color="000000" w:sz="12" w:space="6"/>
+          <w:left w:val="single" w:color="000000" w:sz="12" w:space="6"/>
+          <w:bottom w:val="single" w:color="000000" w:sz="12" w:space="6"/>
+          <w:right w:val="single" w:color="000000" w:sz="12" w:space="6"/>
+        </w:pBdr>
+      </w:pPr>
+      <w:r>
+        <w:rPr>
+          <w:b/>
+          <w:bCs/>
+        </w:rPr>
+        <w:t xml:space="preserve">Con las manos. </w:t>
+      </w:r>
+      <w:r>
+        <w:t xml:space="preserve">Arma esta posición en tu tablero. Prueba con tus piezas las jugadas de las blancas. Después de cada una, toca las casillas de alrededor del rey negro: ¿puede escapar a alguna?</w:t>
+      </w:r>
+    </w:p>
+    <w:p>
+      <w:pPr>
+        <w:keepNext/>
+        <w:keepLines/>
       </w:pPr>
       <w:r>
         <w:rPr>
@@ -2803,7 +3182,7 @@
       <w:r>
         <w:drawing>
           <wp:inline distT="0" distB="0" distL="0" distR="0">
-            <wp:extent cx="3887986" cy="3887986"/>
+            <wp:extent cx="3239988" cy="3239988"/>
             <wp:effectExtent t="0" r="0" b="0" l="0"/>
             <wp:docPr id="1" name="Dibujo decorativo" descr="" title="">
               <a:extLst xmlns:a="http://schemas.openxmlformats.org/drawingml/2006/main">
@@ -2834,7 +3213,7 @@
                   <pic:spPr bwMode="auto">
                     <a:xfrm>
                       <a:off x="0" y="0"/>
-                      <a:ext cx="3887986" cy="3887986"/>
+                      <a:ext cx="3239988" cy="3239988"/>
                     </a:xfrm>
                     <a:prstGeom prst="rect">
                       <a:avLst/>
@@ -2867,6 +3246,28 @@
       </w:r>
       <w:r>
         <w:t xml:space="preserve">Piezas blancas: rey en a2; torres en b8, c6. Piezas negras: rey en h7.</w:t>
+      </w:r>
+    </w:p>
+    <w:p>
+      <w:pPr>
+        <w:keepNext/>
+        <w:keepLines/>
+        <w:pBdr>
+          <w:top w:val="single" w:color="000000" w:sz="12" w:space="6"/>
+          <w:left w:val="single" w:color="000000" w:sz="12" w:space="6"/>
+          <w:bottom w:val="single" w:color="000000" w:sz="12" w:space="6"/>
+          <w:right w:val="single" w:color="000000" w:sz="12" w:space="6"/>
+        </w:pBdr>
+      </w:pPr>
+      <w:r>
+        <w:rPr>
+          <w:b/>
+          <w:bCs/>
+        </w:rPr>
+        <w:t xml:space="preserve">Con las manos. </w:t>
+      </w:r>
+      <w:r>
+        <w:t xml:space="preserve">Arma esta posición en tu tablero. Prueba con tus piezas: haz la primera jugada, contesta por las negras y busca el mate.</w:t>
       </w:r>
     </w:p>
     <w:p>
@@ -3101,7 +3502,7 @@
       <w:r>
         <w:drawing>
           <wp:inline distT="0" distB="0" distL="0" distR="0">
-            <wp:extent cx="5399931" cy="5399931"/>
+            <wp:extent cx="4319885" cy="4319885"/>
             <wp:effectExtent t="0" r="0" b="0" l="0"/>
             <wp:docPr id="1" name="Dibujo decorativo" descr="" title="">
               <a:extLst xmlns:a="http://schemas.openxmlformats.org/drawingml/2006/main">
@@ -3132,7 +3533,7 @@
                   <pic:spPr bwMode="auto">
                     <a:xfrm>
                       <a:off x="0" y="0"/>
-                      <a:ext cx="5399931" cy="5399931"/>
+                      <a:ext cx="4319885" cy="4319885"/>
                     </a:xfrm>
                     <a:prstGeom prst="rect">
                       <a:avLst/>
@@ -3160,6 +3561,7 @@
     </w:p>
     <w:p>
       <w:pPr>
+        <w:keepNext/>
         <w:keepLines/>
         <w:pBdr>
           <w:top w:val="single" w:color="000000" w:sz="12" w:space="6"/>
@@ -3176,7 +3578,28 @@
         <w:t xml:space="preserve">La posición. </w:t>
       </w:r>
       <w:r>
-        <w:t xml:space="preserve">Piezas blancas: rey en f6; dama en c1. Piezas negras: rey en f8. La flecha va de c1 a c8.</w:t>
+        <w:t xml:space="preserve">Piezas blancas: rey en f6; dama en c1. Piezas negras: rey en f8.</w:t>
+      </w:r>
+    </w:p>
+    <w:p>
+      <w:pPr>
+        <w:keepLines/>
+        <w:pBdr>
+          <w:top w:val="single" w:color="000000" w:sz="12" w:space="6"/>
+          <w:left w:val="single" w:color="000000" w:sz="12" w:space="6"/>
+          <w:bottom w:val="single" w:color="000000" w:sz="12" w:space="6"/>
+          <w:right w:val="single" w:color="000000" w:sz="12" w:space="6"/>
+        </w:pBdr>
+      </w:pPr>
+      <w:r>
+        <w:rPr>
+          <w:b/>
+          <w:bCs/>
+        </w:rPr>
+        <w:t xml:space="preserve">Con las manos. </w:t>
+      </w:r>
+      <w:r>
+        <w:t xml:space="preserve">Arma esta posición en tu tablero. Con el dedo, sigue el camino de c1 a c8.</w:t>
       </w:r>
     </w:p>
     <w:p>
@@ -3260,7 +3683,7 @@
       <w:r>
         <w:drawing>
           <wp:inline distT="0" distB="0" distL="0" distR="0">
-            <wp:extent cx="3887986" cy="3887986"/>
+            <wp:extent cx="3239988" cy="3239988"/>
             <wp:effectExtent t="0" r="0" b="0" l="0"/>
             <wp:docPr id="1" name="Dibujo decorativo" descr="" title="">
               <a:extLst xmlns:a="http://schemas.openxmlformats.org/drawingml/2006/main">
@@ -3291,7 +3714,7 @@
                   <pic:spPr bwMode="auto">
                     <a:xfrm>
                       <a:off x="0" y="0"/>
-                      <a:ext cx="3887986" cy="3887986"/>
+                      <a:ext cx="3239988" cy="3239988"/>
                     </a:xfrm>
                     <a:prstGeom prst="rect">
                       <a:avLst/>
@@ -3330,6 +3753,28 @@
       <w:pPr>
         <w:keepNext/>
         <w:keepLines/>
+        <w:pBdr>
+          <w:top w:val="single" w:color="000000" w:sz="12" w:space="6"/>
+          <w:left w:val="single" w:color="000000" w:sz="12" w:space="6"/>
+          <w:bottom w:val="single" w:color="000000" w:sz="12" w:space="6"/>
+          <w:right w:val="single" w:color="000000" w:sz="12" w:space="6"/>
+        </w:pBdr>
+      </w:pPr>
+      <w:r>
+        <w:rPr>
+          <w:b/>
+          <w:bCs/>
+        </w:rPr>
+        <w:t xml:space="preserve">Con las manos. </w:t>
+      </w:r>
+      <w:r>
+        <w:t xml:space="preserve">Arma esta posición en tu tablero. Prueba con tus piezas las jugadas de las blancas. Después de cada una, toca las casillas de alrededor del rey negro: ¿puede escapar a alguna?</w:t>
+      </w:r>
+    </w:p>
+    <w:p>
+      <w:pPr>
+        <w:keepNext/>
+        <w:keepLines/>
       </w:pPr>
       <w:r>
         <w:rPr>
@@ -3377,7 +3822,7 @@
       <w:r>
         <w:drawing>
           <wp:inline distT="0" distB="0" distL="0" distR="0">
-            <wp:extent cx="3887986" cy="3887986"/>
+            <wp:extent cx="3239988" cy="3239988"/>
             <wp:effectExtent t="0" r="0" b="0" l="0"/>
             <wp:docPr id="1" name="Dibujo decorativo" descr="" title="">
               <a:extLst xmlns:a="http://schemas.openxmlformats.org/drawingml/2006/main">
@@ -3408,7 +3853,7 @@
                   <pic:spPr bwMode="auto">
                     <a:xfrm>
                       <a:off x="0" y="0"/>
-                      <a:ext cx="3887986" cy="3887986"/>
+                      <a:ext cx="3239988" cy="3239988"/>
                     </a:xfrm>
                     <a:prstGeom prst="rect">
                       <a:avLst/>
@@ -3447,6 +3892,28 @@
       <w:pPr>
         <w:keepNext/>
         <w:keepLines/>
+        <w:pBdr>
+          <w:top w:val="single" w:color="000000" w:sz="12" w:space="6"/>
+          <w:left w:val="single" w:color="000000" w:sz="12" w:space="6"/>
+          <w:bottom w:val="single" w:color="000000" w:sz="12" w:space="6"/>
+          <w:right w:val="single" w:color="000000" w:sz="12" w:space="6"/>
+        </w:pBdr>
+      </w:pPr>
+      <w:r>
+        <w:rPr>
+          <w:b/>
+          <w:bCs/>
+        </w:rPr>
+        <w:t xml:space="preserve">Con las manos. </w:t>
+      </w:r>
+      <w:r>
+        <w:t xml:space="preserve">Arma esta posición en tu tablero. Prueba con tus piezas las jugadas de las blancas. Después de cada una, toca las casillas de alrededor del rey negro: ¿puede escapar a alguna?</w:t>
+      </w:r>
+    </w:p>
+    <w:p>
+      <w:pPr>
+        <w:keepNext/>
+        <w:keepLines/>
       </w:pPr>
       <w:r>
         <w:rPr>
@@ -3494,7 +3961,7 @@
       <w:r>
         <w:drawing>
           <wp:inline distT="0" distB="0" distL="0" distR="0">
-            <wp:extent cx="3887986" cy="3887986"/>
+            <wp:extent cx="3239988" cy="3239988"/>
             <wp:effectExtent t="0" r="0" b="0" l="0"/>
             <wp:docPr id="1" name="Dibujo decorativo" descr="" title="">
               <a:extLst xmlns:a="http://schemas.openxmlformats.org/drawingml/2006/main">
@@ -3525,7 +3992,7 @@
                   <pic:spPr bwMode="auto">
                     <a:xfrm>
                       <a:off x="0" y="0"/>
-                      <a:ext cx="3887986" cy="3887986"/>
+                      <a:ext cx="3239988" cy="3239988"/>
                     </a:xfrm>
                     <a:prstGeom prst="rect">
                       <a:avLst/>
@@ -3558,6 +4025,28 @@
       </w:r>
       <w:r>
         <w:t xml:space="preserve">Piezas blancas: rey en f3; dama en c6. Piezas negras: rey en f1.</w:t>
+      </w:r>
+    </w:p>
+    <w:p>
+      <w:pPr>
+        <w:keepNext/>
+        <w:keepLines/>
+        <w:pBdr>
+          <w:top w:val="single" w:color="000000" w:sz="12" w:space="6"/>
+          <w:left w:val="single" w:color="000000" w:sz="12" w:space="6"/>
+          <w:bottom w:val="single" w:color="000000" w:sz="12" w:space="6"/>
+          <w:right w:val="single" w:color="000000" w:sz="12" w:space="6"/>
+        </w:pBdr>
+      </w:pPr>
+      <w:r>
+        <w:rPr>
+          <w:b/>
+          <w:bCs/>
+        </w:rPr>
+        <w:t xml:space="preserve">Con las manos. </w:t>
+      </w:r>
+      <w:r>
+        <w:t xml:space="preserve">Arma esta posición en tu tablero. Prueba con tus piezas las jugadas de las blancas. Después de cada una, toca las casillas de alrededor del rey negro: ¿puede escapar a alguna?</w:t>
       </w:r>
     </w:p>
     <w:p>
@@ -3792,7 +4281,7 @@
       <w:r>
         <w:drawing>
           <wp:inline distT="0" distB="0" distL="0" distR="0">
-            <wp:extent cx="5399931" cy="5399931"/>
+            <wp:extent cx="4319885" cy="4319885"/>
             <wp:effectExtent t="0" r="0" b="0" l="0"/>
             <wp:docPr id="1" name="Dibujo decorativo" descr="" title="">
               <a:extLst xmlns:a="http://schemas.openxmlformats.org/drawingml/2006/main">
@@ -3823,7 +4312,7 @@
                   <pic:spPr bwMode="auto">
                     <a:xfrm>
                       <a:off x="0" y="0"/>
-                      <a:ext cx="5399931" cy="5399931"/>
+                      <a:ext cx="4319885" cy="4319885"/>
                     </a:xfrm>
                     <a:prstGeom prst="rect">
                       <a:avLst/>
@@ -3851,6 +4340,7 @@
     </w:p>
     <w:p>
       <w:pPr>
+        <w:keepNext/>
         <w:keepLines/>
         <w:pBdr>
           <w:top w:val="single" w:color="000000" w:sz="12" w:space="6"/>
@@ -3872,6 +4362,27 @@
     </w:p>
     <w:p>
       <w:pPr>
+        <w:keepLines/>
+        <w:pBdr>
+          <w:top w:val="single" w:color="000000" w:sz="12" w:space="6"/>
+          <w:left w:val="single" w:color="000000" w:sz="12" w:space="6"/>
+          <w:bottom w:val="single" w:color="000000" w:sz="12" w:space="6"/>
+          <w:right w:val="single" w:color="000000" w:sz="12" w:space="6"/>
+        </w:pBdr>
+      </w:pPr>
+      <w:r>
+        <w:rPr>
+          <w:b/>
+          <w:bCs/>
+        </w:rPr>
+        <w:t xml:space="preserve">Con las manos. </w:t>
+      </w:r>
+      <w:r>
+        <w:t xml:space="preserve">Arma esta posición en tu tablero.</w:t>
+      </w:r>
+    </w:p>
+    <w:p>
+      <w:pPr>
         <w:pStyle w:val="Heading3"/>
         <w:keepNext/>
         <w:keepLines/>
@@ -3951,7 +4462,7 @@
       <w:r>
         <w:drawing>
           <wp:inline distT="0" distB="0" distL="0" distR="0">
-            <wp:extent cx="3887986" cy="3887986"/>
+            <wp:extent cx="3239988" cy="3239988"/>
             <wp:effectExtent t="0" r="0" b="0" l="0"/>
             <wp:docPr id="1" name="Dibujo decorativo" descr="" title="">
               <a:extLst xmlns:a="http://schemas.openxmlformats.org/drawingml/2006/main">
@@ -3982,7 +4493,7 @@
                   <pic:spPr bwMode="auto">
                     <a:xfrm>
                       <a:off x="0" y="0"/>
-                      <a:ext cx="3887986" cy="3887986"/>
+                      <a:ext cx="3239988" cy="3239988"/>
                     </a:xfrm>
                     <a:prstGeom prst="rect">
                       <a:avLst/>
@@ -4021,13 +4532,35 @@
       <w:pPr>
         <w:keepNext/>
         <w:keepLines/>
-      </w:pPr>
-      <w:r>
-        <w:rPr>
-          <w:b/>
-          <w:bCs/>
-        </w:rPr>
-        <w:t xml:space="preserve">Le toca mover al rey negro. ¿Qué pasó? ¿Jaque mate, ahogado o ninguno?</w:t>
+        <w:pBdr>
+          <w:top w:val="single" w:color="000000" w:sz="12" w:space="6"/>
+          <w:left w:val="single" w:color="000000" w:sz="12" w:space="6"/>
+          <w:bottom w:val="single" w:color="000000" w:sz="12" w:space="6"/>
+          <w:right w:val="single" w:color="000000" w:sz="12" w:space="6"/>
+        </w:pBdr>
+      </w:pPr>
+      <w:r>
+        <w:rPr>
+          <w:b/>
+          <w:bCs/>
+        </w:rPr>
+        <w:t xml:space="preserve">Con las manos. </w:t>
+      </w:r>
+      <w:r>
+        <w:t xml:space="preserve">Arma esta posición en tu tablero. Toca, una por una, las casillas de alrededor del rey negro. Para cada una, busca si alguna pieza blanca llega hasta ahí.</w:t>
+      </w:r>
+    </w:p>
+    <w:p>
+      <w:pPr>
+        <w:keepNext/>
+        <w:keepLines/>
+      </w:pPr>
+      <w:r>
+        <w:rPr>
+          <w:b/>
+          <w:bCs/>
+        </w:rPr>
+        <w:t xml:space="preserve">Le toca mover al rey negro. ¿Qué pasó: jaque mate, ahogado o ninguno?</w:t>
       </w:r>
     </w:p>
     <w:p>
@@ -4068,7 +4601,7 @@
       <w:r>
         <w:drawing>
           <wp:inline distT="0" distB="0" distL="0" distR="0">
-            <wp:extent cx="3887986" cy="3887986"/>
+            <wp:extent cx="3239988" cy="3239988"/>
             <wp:effectExtent t="0" r="0" b="0" l="0"/>
             <wp:docPr id="1" name="Dibujo decorativo" descr="" title="">
               <a:extLst xmlns:a="http://schemas.openxmlformats.org/drawingml/2006/main">
@@ -4099,7 +4632,7 @@
                   <pic:spPr bwMode="auto">
                     <a:xfrm>
                       <a:off x="0" y="0"/>
-                      <a:ext cx="3887986" cy="3887986"/>
+                      <a:ext cx="3239988" cy="3239988"/>
                     </a:xfrm>
                     <a:prstGeom prst="rect">
                       <a:avLst/>
@@ -4138,13 +4671,35 @@
       <w:pPr>
         <w:keepNext/>
         <w:keepLines/>
-      </w:pPr>
-      <w:r>
-        <w:rPr>
-          <w:b/>
-          <w:bCs/>
-        </w:rPr>
-        <w:t xml:space="preserve">Le toca mover al rey negro. ¿Qué pasó? ¿Jaque mate, ahogado o ninguno?</w:t>
+        <w:pBdr>
+          <w:top w:val="single" w:color="000000" w:sz="12" w:space="6"/>
+          <w:left w:val="single" w:color="000000" w:sz="12" w:space="6"/>
+          <w:bottom w:val="single" w:color="000000" w:sz="12" w:space="6"/>
+          <w:right w:val="single" w:color="000000" w:sz="12" w:space="6"/>
+        </w:pBdr>
+      </w:pPr>
+      <w:r>
+        <w:rPr>
+          <w:b/>
+          <w:bCs/>
+        </w:rPr>
+        <w:t xml:space="preserve">Con las manos. </w:t>
+      </w:r>
+      <w:r>
+        <w:t xml:space="preserve">Arma esta posición en tu tablero. Toca, una por una, las casillas de alrededor del rey negro. Para cada una, busca si alguna pieza blanca llega hasta ahí.</w:t>
+      </w:r>
+    </w:p>
+    <w:p>
+      <w:pPr>
+        <w:keepNext/>
+        <w:keepLines/>
+      </w:pPr>
+      <w:r>
+        <w:rPr>
+          <w:b/>
+          <w:bCs/>
+        </w:rPr>
+        <w:t xml:space="preserve">Le toca mover al rey negro. ¿Qué pasó: jaque mate, ahogado o ninguno?</w:t>
       </w:r>
     </w:p>
     <w:p>
@@ -4185,7 +4740,7 @@
       <w:r>
         <w:drawing>
           <wp:inline distT="0" distB="0" distL="0" distR="0">
-            <wp:extent cx="3887986" cy="3887986"/>
+            <wp:extent cx="3239988" cy="3239988"/>
             <wp:effectExtent t="0" r="0" b="0" l="0"/>
             <wp:docPr id="1" name="Dibujo decorativo" descr="" title="">
               <a:extLst xmlns:a="http://schemas.openxmlformats.org/drawingml/2006/main">
@@ -4216,7 +4771,7 @@
                   <pic:spPr bwMode="auto">
                     <a:xfrm>
                       <a:off x="0" y="0"/>
-                      <a:ext cx="3887986" cy="3887986"/>
+                      <a:ext cx="3239988" cy="3239988"/>
                     </a:xfrm>
                     <a:prstGeom prst="rect">
                       <a:avLst/>
@@ -4255,6 +4810,28 @@
       <w:pPr>
         <w:keepNext/>
         <w:keepLines/>
+        <w:pBdr>
+          <w:top w:val="single" w:color="000000" w:sz="12" w:space="6"/>
+          <w:left w:val="single" w:color="000000" w:sz="12" w:space="6"/>
+          <w:bottom w:val="single" w:color="000000" w:sz="12" w:space="6"/>
+          <w:right w:val="single" w:color="000000" w:sz="12" w:space="6"/>
+        </w:pBdr>
+      </w:pPr>
+      <w:r>
+        <w:rPr>
+          <w:b/>
+          <w:bCs/>
+        </w:rPr>
+        <w:t xml:space="preserve">Con las manos. </w:t>
+      </w:r>
+      <w:r>
+        <w:t xml:space="preserve">Arma esta posición en tu tablero. Prueba las dos jugadas con tus piezas, una por vez, y toca las casillas de alrededor del rey negro.</w:t>
+      </w:r>
+    </w:p>
+    <w:p>
+      <w:pPr>
+        <w:keepNext/>
+        <w:keepLines/>
       </w:pPr>
       <w:r>
         <w:rPr>
@@ -4302,7 +4879,7 @@
       <w:r>
         <w:drawing>
           <wp:inline distT="0" distB="0" distL="0" distR="0">
-            <wp:extent cx="3887986" cy="3887986"/>
+            <wp:extent cx="3239988" cy="3239988"/>
             <wp:effectExtent t="0" r="0" b="0" l="0"/>
             <wp:docPr id="1" name="Dibujo decorativo" descr="" title="">
               <a:extLst xmlns:a="http://schemas.openxmlformats.org/drawingml/2006/main">
@@ -4333,7 +4910,7 @@
                   <pic:spPr bwMode="auto">
                     <a:xfrm>
                       <a:off x="0" y="0"/>
-                      <a:ext cx="3887986" cy="3887986"/>
+                      <a:ext cx="3239988" cy="3239988"/>
                     </a:xfrm>
                     <a:prstGeom prst="rect">
                       <a:avLst/>
@@ -4366,6 +4943,28 @@
       </w:r>
       <w:r>
         <w:t xml:space="preserve">Piezas blancas: rey en b6; dama en c1. Piezas negras: rey en a8.</w:t>
+      </w:r>
+    </w:p>
+    <w:p>
+      <w:pPr>
+        <w:keepNext/>
+        <w:keepLines/>
+        <w:pBdr>
+          <w:top w:val="single" w:color="000000" w:sz="12" w:space="6"/>
+          <w:left w:val="single" w:color="000000" w:sz="12" w:space="6"/>
+          <w:bottom w:val="single" w:color="000000" w:sz="12" w:space="6"/>
+          <w:right w:val="single" w:color="000000" w:sz="12" w:space="6"/>
+        </w:pBdr>
+      </w:pPr>
+      <w:r>
+        <w:rPr>
+          <w:b/>
+          <w:bCs/>
+        </w:rPr>
+        <w:t xml:space="preserve">Con las manos. </w:t>
+      </w:r>
+      <w:r>
+        <w:t xml:space="preserve">Arma esta posición en tu tablero. Prueba las dos jugadas con tus piezas, una por vez, y toca las casillas de alrededor del rey negro.</w:t>
       </w:r>
     </w:p>
     <w:p>
@@ -4588,7 +5187,7 @@
       <w:r>
         <w:drawing>
           <wp:inline distT="0" distB="0" distL="0" distR="0">
-            <wp:extent cx="5399931" cy="5399931"/>
+            <wp:extent cx="4319885" cy="4319885"/>
             <wp:effectExtent t="0" r="0" b="0" l="0"/>
             <wp:docPr id="1" name="Dibujo decorativo" descr="" title="">
               <a:extLst xmlns:a="http://schemas.openxmlformats.org/drawingml/2006/main">
@@ -4619,7 +5218,7 @@
                   <pic:spPr bwMode="auto">
                     <a:xfrm>
                       <a:off x="0" y="0"/>
-                      <a:ext cx="5399931" cy="5399931"/>
+                      <a:ext cx="4319885" cy="4319885"/>
                     </a:xfrm>
                     <a:prstGeom prst="rect">
                       <a:avLst/>
@@ -4647,6 +5246,7 @@
     </w:p>
     <w:p>
       <w:pPr>
+        <w:keepNext/>
         <w:keepLines/>
         <w:pBdr>
           <w:top w:val="single" w:color="000000" w:sz="12" w:space="6"/>
@@ -4663,7 +5263,28 @@
         <w:t xml:space="preserve">La posición. </w:t>
       </w:r>
       <w:r>
-        <w:t xml:space="preserve">Piezas blancas: rey en b6; dama en b7. Piezas negras: rey en a8. La flecha va de b6 a b7.</w:t>
+        <w:t xml:space="preserve">Piezas blancas: rey en b6; dama en b7. Piezas negras: rey en a8.</w:t>
+      </w:r>
+    </w:p>
+    <w:p>
+      <w:pPr>
+        <w:keepLines/>
+        <w:pBdr>
+          <w:top w:val="single" w:color="000000" w:sz="12" w:space="6"/>
+          <w:left w:val="single" w:color="000000" w:sz="12" w:space="6"/>
+          <w:bottom w:val="single" w:color="000000" w:sz="12" w:space="6"/>
+          <w:right w:val="single" w:color="000000" w:sz="12" w:space="6"/>
+        </w:pBdr>
+      </w:pPr>
+      <w:r>
+        <w:rPr>
+          <w:b/>
+          <w:bCs/>
+        </w:rPr>
+        <w:t xml:space="preserve">Con las manos. </w:t>
+      </w:r>
+      <w:r>
+        <w:t xml:space="preserve">Arma esta posición en tu tablero. Con el dedo, sigue el camino de b6 a b7.</w:t>
       </w:r>
     </w:p>
     <w:p>
@@ -4747,7 +5368,7 @@
       <w:r>
         <w:drawing>
           <wp:inline distT="0" distB="0" distL="0" distR="0">
-            <wp:extent cx="3887986" cy="3887986"/>
+            <wp:extent cx="3239988" cy="3239988"/>
             <wp:effectExtent t="0" r="0" b="0" l="0"/>
             <wp:docPr id="1" name="Dibujo decorativo" descr="" title="">
               <a:extLst xmlns:a="http://schemas.openxmlformats.org/drawingml/2006/main">
@@ -4778,7 +5399,7 @@
                   <pic:spPr bwMode="auto">
                     <a:xfrm>
                       <a:off x="0" y="0"/>
-                      <a:ext cx="3887986" cy="3887986"/>
+                      <a:ext cx="3239988" cy="3239988"/>
                     </a:xfrm>
                     <a:prstGeom prst="rect">
                       <a:avLst/>
@@ -4817,6 +5438,28 @@
       <w:pPr>
         <w:keepNext/>
         <w:keepLines/>
+        <w:pBdr>
+          <w:top w:val="single" w:color="000000" w:sz="12" w:space="6"/>
+          <w:left w:val="single" w:color="000000" w:sz="12" w:space="6"/>
+          <w:bottom w:val="single" w:color="000000" w:sz="12" w:space="6"/>
+          <w:right w:val="single" w:color="000000" w:sz="12" w:space="6"/>
+        </w:pBdr>
+      </w:pPr>
+      <w:r>
+        <w:rPr>
+          <w:b/>
+          <w:bCs/>
+        </w:rPr>
+        <w:t xml:space="preserve">Con las manos. </w:t>
+      </w:r>
+      <w:r>
+        <w:t xml:space="preserve">Arma esta posición en tu tablero. Prueba con tus piezas las jugadas de las blancas. Después de cada una, toca las casillas de alrededor del rey negro: ¿puede escapar a alguna?</w:t>
+      </w:r>
+    </w:p>
+    <w:p>
+      <w:pPr>
+        <w:keepNext/>
+        <w:keepLines/>
       </w:pPr>
       <w:r>
         <w:rPr>
@@ -4864,7 +5507,7 @@
       <w:r>
         <w:drawing>
           <wp:inline distT="0" distB="0" distL="0" distR="0">
-            <wp:extent cx="3887986" cy="3887986"/>
+            <wp:extent cx="3239988" cy="3239988"/>
             <wp:effectExtent t="0" r="0" b="0" l="0"/>
             <wp:docPr id="1" name="Dibujo decorativo" descr="" title="">
               <a:extLst xmlns:a="http://schemas.openxmlformats.org/drawingml/2006/main">
@@ -4895,7 +5538,7 @@
                   <pic:spPr bwMode="auto">
                     <a:xfrm>
                       <a:off x="0" y="0"/>
-                      <a:ext cx="3887986" cy="3887986"/>
+                      <a:ext cx="3239988" cy="3239988"/>
                     </a:xfrm>
                     <a:prstGeom prst="rect">
                       <a:avLst/>
@@ -4934,6 +5577,28 @@
       <w:pPr>
         <w:keepNext/>
         <w:keepLines/>
+        <w:pBdr>
+          <w:top w:val="single" w:color="000000" w:sz="12" w:space="6"/>
+          <w:left w:val="single" w:color="000000" w:sz="12" w:space="6"/>
+          <w:bottom w:val="single" w:color="000000" w:sz="12" w:space="6"/>
+          <w:right w:val="single" w:color="000000" w:sz="12" w:space="6"/>
+        </w:pBdr>
+      </w:pPr>
+      <w:r>
+        <w:rPr>
+          <w:b/>
+          <w:bCs/>
+        </w:rPr>
+        <w:t xml:space="preserve">Con las manos. </w:t>
+      </w:r>
+      <w:r>
+        <w:t xml:space="preserve">Arma esta posición en tu tablero. Prueba con tus piezas las jugadas de las blancas. Después de cada una, toca las casillas de alrededor del rey negro: ¿puede escapar a alguna?</w:t>
+      </w:r>
+    </w:p>
+    <w:p>
+      <w:pPr>
+        <w:keepNext/>
+        <w:keepLines/>
       </w:pPr>
       <w:r>
         <w:rPr>
@@ -4981,7 +5646,7 @@
       <w:r>
         <w:drawing>
           <wp:inline distT="0" distB="0" distL="0" distR="0">
-            <wp:extent cx="3887986" cy="3887986"/>
+            <wp:extent cx="3239988" cy="3239988"/>
             <wp:effectExtent t="0" r="0" b="0" l="0"/>
             <wp:docPr id="1" name="Dibujo decorativo" descr="" title="">
               <a:extLst xmlns:a="http://schemas.openxmlformats.org/drawingml/2006/main">
@@ -5012,7 +5677,7 @@
                   <pic:spPr bwMode="auto">
                     <a:xfrm>
                       <a:off x="0" y="0"/>
-                      <a:ext cx="3887986" cy="3887986"/>
+                      <a:ext cx="3239988" cy="3239988"/>
                     </a:xfrm>
                     <a:prstGeom prst="rect">
                       <a:avLst/>
@@ -5045,6 +5710,28 @@
       </w:r>
       <w:r>
         <w:t xml:space="preserve">Piezas blancas: rey en f6; dama en b4. Piezas negras: rey en e8.</w:t>
+      </w:r>
+    </w:p>
+    <w:p>
+      <w:pPr>
+        <w:keepNext/>
+        <w:keepLines/>
+        <w:pBdr>
+          <w:top w:val="single" w:color="000000" w:sz="12" w:space="6"/>
+          <w:left w:val="single" w:color="000000" w:sz="12" w:space="6"/>
+          <w:bottom w:val="single" w:color="000000" w:sz="12" w:space="6"/>
+          <w:right w:val="single" w:color="000000" w:sz="12" w:space="6"/>
+        </w:pBdr>
+      </w:pPr>
+      <w:r>
+        <w:rPr>
+          <w:b/>
+          <w:bCs/>
+        </w:rPr>
+        <w:t xml:space="preserve">Con las manos. </w:t>
+      </w:r>
+      <w:r>
+        <w:t xml:space="preserve">Arma esta posición en tu tablero. Prueba con tus piezas las jugadas de las blancas. Después de cada una, toca las casillas de alrededor del rey negro: ¿puede escapar a alguna?</w:t>
       </w:r>
     </w:p>
     <w:p>
@@ -5267,7 +5954,7 @@
       <w:r>
         <w:drawing>
           <wp:inline distT="0" distB="0" distL="0" distR="0">
-            <wp:extent cx="5399931" cy="5399931"/>
+            <wp:extent cx="4319885" cy="4319885"/>
             <wp:effectExtent t="0" r="0" b="0" l="0"/>
             <wp:docPr id="1" name="Dibujo decorativo" descr="" title="">
               <a:extLst xmlns:a="http://schemas.openxmlformats.org/drawingml/2006/main">
@@ -5298,7 +5985,7 @@
                   <pic:spPr bwMode="auto">
                     <a:xfrm>
                       <a:off x="0" y="0"/>
-                      <a:ext cx="5399931" cy="5399931"/>
+                      <a:ext cx="4319885" cy="4319885"/>
                     </a:xfrm>
                     <a:prstGeom prst="rect">
                       <a:avLst/>
@@ -5326,6 +6013,7 @@
     </w:p>
     <w:p>
       <w:pPr>
+        <w:keepNext/>
         <w:keepLines/>
         <w:pBdr>
           <w:top w:val="single" w:color="000000" w:sz="12" w:space="6"/>
@@ -5342,7 +6030,28 @@
         <w:t xml:space="preserve">La posición. </w:t>
       </w:r>
       <w:r>
-        <w:t xml:space="preserve">Piezas blancas: rey en b6; torre en h1. Piezas negras: rey en b8. La flecha va de h1 a h8.</w:t>
+        <w:t xml:space="preserve">Piezas blancas: rey en b6; torre en h1. Piezas negras: rey en b8.</w:t>
+      </w:r>
+    </w:p>
+    <w:p>
+      <w:pPr>
+        <w:keepLines/>
+        <w:pBdr>
+          <w:top w:val="single" w:color="000000" w:sz="12" w:space="6"/>
+          <w:left w:val="single" w:color="000000" w:sz="12" w:space="6"/>
+          <w:bottom w:val="single" w:color="000000" w:sz="12" w:space="6"/>
+          <w:right w:val="single" w:color="000000" w:sz="12" w:space="6"/>
+        </w:pBdr>
+      </w:pPr>
+      <w:r>
+        <w:rPr>
+          <w:b/>
+          <w:bCs/>
+        </w:rPr>
+        <w:t xml:space="preserve">Con las manos. </w:t>
+      </w:r>
+      <w:r>
+        <w:t xml:space="preserve">Arma esta posición en tu tablero. Con el dedo, sigue el camino de h1 a h8.</w:t>
       </w:r>
     </w:p>
     <w:p>
@@ -5426,7 +6135,7 @@
       <w:r>
         <w:drawing>
           <wp:inline distT="0" distB="0" distL="0" distR="0">
-            <wp:extent cx="3887986" cy="3887986"/>
+            <wp:extent cx="3239988" cy="3239988"/>
             <wp:effectExtent t="0" r="0" b="0" l="0"/>
             <wp:docPr id="1" name="Dibujo decorativo" descr="" title="">
               <a:extLst xmlns:a="http://schemas.openxmlformats.org/drawingml/2006/main">
@@ -5457,7 +6166,7 @@
                   <pic:spPr bwMode="auto">
                     <a:xfrm>
                       <a:off x="0" y="0"/>
-                      <a:ext cx="3887986" cy="3887986"/>
+                      <a:ext cx="3239988" cy="3239988"/>
                     </a:xfrm>
                     <a:prstGeom prst="rect">
                       <a:avLst/>
@@ -5496,6 +6205,28 @@
       <w:pPr>
         <w:keepNext/>
         <w:keepLines/>
+        <w:pBdr>
+          <w:top w:val="single" w:color="000000" w:sz="12" w:space="6"/>
+          <w:left w:val="single" w:color="000000" w:sz="12" w:space="6"/>
+          <w:bottom w:val="single" w:color="000000" w:sz="12" w:space="6"/>
+          <w:right w:val="single" w:color="000000" w:sz="12" w:space="6"/>
+        </w:pBdr>
+      </w:pPr>
+      <w:r>
+        <w:rPr>
+          <w:b/>
+          <w:bCs/>
+        </w:rPr>
+        <w:t xml:space="preserve">Con las manos. </w:t>
+      </w:r>
+      <w:r>
+        <w:t xml:space="preserve">Arma esta posición en tu tablero. Prueba con tus piezas las jugadas de las blancas. Después de cada una, toca las casillas de alrededor del rey negro: ¿puede escapar a alguna?</w:t>
+      </w:r>
+    </w:p>
+    <w:p>
+      <w:pPr>
+        <w:keepNext/>
+        <w:keepLines/>
       </w:pPr>
       <w:r>
         <w:rPr>
@@ -5543,7 +6274,7 @@
       <w:r>
         <w:drawing>
           <wp:inline distT="0" distB="0" distL="0" distR="0">
-            <wp:extent cx="3887986" cy="3887986"/>
+            <wp:extent cx="3239988" cy="3239988"/>
             <wp:effectExtent t="0" r="0" b="0" l="0"/>
             <wp:docPr id="1" name="Dibujo decorativo" descr="" title="">
               <a:extLst xmlns:a="http://schemas.openxmlformats.org/drawingml/2006/main">
@@ -5574,7 +6305,7 @@
                   <pic:spPr bwMode="auto">
                     <a:xfrm>
                       <a:off x="0" y="0"/>
-                      <a:ext cx="3887986" cy="3887986"/>
+                      <a:ext cx="3239988" cy="3239988"/>
                     </a:xfrm>
                     <a:prstGeom prst="rect">
                       <a:avLst/>
@@ -5613,6 +6344,28 @@
       <w:pPr>
         <w:keepNext/>
         <w:keepLines/>
+        <w:pBdr>
+          <w:top w:val="single" w:color="000000" w:sz="12" w:space="6"/>
+          <w:left w:val="single" w:color="000000" w:sz="12" w:space="6"/>
+          <w:bottom w:val="single" w:color="000000" w:sz="12" w:space="6"/>
+          <w:right w:val="single" w:color="000000" w:sz="12" w:space="6"/>
+        </w:pBdr>
+      </w:pPr>
+      <w:r>
+        <w:rPr>
+          <w:b/>
+          <w:bCs/>
+        </w:rPr>
+        <w:t xml:space="preserve">Con las manos. </w:t>
+      </w:r>
+      <w:r>
+        <w:t xml:space="preserve">Arma esta posición en tu tablero. Prueba con tus piezas las jugadas de las blancas. Después de cada una, toca las casillas de alrededor del rey negro: ¿puede escapar a alguna?</w:t>
+      </w:r>
+    </w:p>
+    <w:p>
+      <w:pPr>
+        <w:keepNext/>
+        <w:keepLines/>
       </w:pPr>
       <w:r>
         <w:rPr>
@@ -5660,7 +6413,7 @@
       <w:r>
         <w:drawing>
           <wp:inline distT="0" distB="0" distL="0" distR="0">
-            <wp:extent cx="3887986" cy="3887986"/>
+            <wp:extent cx="3239988" cy="3239988"/>
             <wp:effectExtent t="0" r="0" b="0" l="0"/>
             <wp:docPr id="1" name="Dibujo decorativo" descr="" title="">
               <a:extLst xmlns:a="http://schemas.openxmlformats.org/drawingml/2006/main">
@@ -5691,7 +6444,7 @@
                   <pic:spPr bwMode="auto">
                     <a:xfrm>
                       <a:off x="0" y="0"/>
-                      <a:ext cx="3887986" cy="3887986"/>
+                      <a:ext cx="3239988" cy="3239988"/>
                     </a:xfrm>
                     <a:prstGeom prst="rect">
                       <a:avLst/>
@@ -5730,6 +6483,28 @@
       <w:pPr>
         <w:keepNext/>
         <w:keepLines/>
+        <w:pBdr>
+          <w:top w:val="single" w:color="000000" w:sz="12" w:space="6"/>
+          <w:left w:val="single" w:color="000000" w:sz="12" w:space="6"/>
+          <w:bottom w:val="single" w:color="000000" w:sz="12" w:space="6"/>
+          <w:right w:val="single" w:color="000000" w:sz="12" w:space="6"/>
+        </w:pBdr>
+      </w:pPr>
+      <w:r>
+        <w:rPr>
+          <w:b/>
+          <w:bCs/>
+        </w:rPr>
+        <w:t xml:space="preserve">Con las manos. </w:t>
+      </w:r>
+      <w:r>
+        <w:t xml:space="preserve">Arma esta posición en tu tablero. Prueba con tus piezas: haz la primera jugada, contesta por las negras y busca el mate.</w:t>
+      </w:r>
+    </w:p>
+    <w:p>
+      <w:pPr>
+        <w:keepNext/>
+        <w:keepLines/>
       </w:pPr>
       <w:r>
         <w:rPr>
@@ -5777,7 +6552,7 @@
       <w:r>
         <w:drawing>
           <wp:inline distT="0" distB="0" distL="0" distR="0">
-            <wp:extent cx="3887986" cy="3887986"/>
+            <wp:extent cx="3239988" cy="3239988"/>
             <wp:effectExtent t="0" r="0" b="0" l="0"/>
             <wp:docPr id="1" name="Dibujo decorativo" descr="" title="">
               <a:extLst xmlns:a="http://schemas.openxmlformats.org/drawingml/2006/main">
@@ -5808,7 +6583,7 @@
                   <pic:spPr bwMode="auto">
                     <a:xfrm>
                       <a:off x="0" y="0"/>
-                      <a:ext cx="3887986" cy="3887986"/>
+                      <a:ext cx="3239988" cy="3239988"/>
                     </a:xfrm>
                     <a:prstGeom prst="rect">
                       <a:avLst/>
@@ -5841,6 +6616,28 @@
       </w:r>
       <w:r>
         <w:t xml:space="preserve">Piezas blancas: rey en c6; torre en b1. Piezas negras: rey en a8.</w:t>
+      </w:r>
+    </w:p>
+    <w:p>
+      <w:pPr>
+        <w:keepNext/>
+        <w:keepLines/>
+        <w:pBdr>
+          <w:top w:val="single" w:color="000000" w:sz="12" w:space="6"/>
+          <w:left w:val="single" w:color="000000" w:sz="12" w:space="6"/>
+          <w:bottom w:val="single" w:color="000000" w:sz="12" w:space="6"/>
+          <w:right w:val="single" w:color="000000" w:sz="12" w:space="6"/>
+        </w:pBdr>
+      </w:pPr>
+      <w:r>
+        <w:rPr>
+          <w:b/>
+          <w:bCs/>
+        </w:rPr>
+        <w:t xml:space="preserve">Con las manos. </w:t>
+      </w:r>
+      <w:r>
+        <w:t xml:space="preserve">Arma esta posición en tu tablero. Prueba con tus piezas: haz la primera jugada, contesta por las negras y busca el mate.</w:t>
       </w:r>
     </w:p>
     <w:p>
@@ -6063,7 +6860,7 @@
       <w:r>
         <w:drawing>
           <wp:inline distT="0" distB="0" distL="0" distR="0">
-            <wp:extent cx="5399931" cy="5399931"/>
+            <wp:extent cx="4319885" cy="4319885"/>
             <wp:effectExtent t="0" r="0" b="0" l="0"/>
             <wp:docPr id="1" name="Dibujo decorativo" descr="" title="">
               <a:extLst xmlns:a="http://schemas.openxmlformats.org/drawingml/2006/main">
@@ -6094,7 +6891,7 @@
                   <pic:spPr bwMode="auto">
                     <a:xfrm>
                       <a:off x="0" y="0"/>
-                      <a:ext cx="5399931" cy="5399931"/>
+                      <a:ext cx="4319885" cy="4319885"/>
                     </a:xfrm>
                     <a:prstGeom prst="rect">
                       <a:avLst/>
@@ -6122,6 +6919,7 @@
     </w:p>
     <w:p>
       <w:pPr>
+        <w:keepNext/>
         <w:keepLines/>
         <w:pBdr>
           <w:top w:val="single" w:color="000000" w:sz="12" w:space="6"/>
@@ -6138,7 +6936,28 @@
         <w:t xml:space="preserve">La posición. </w:t>
       </w:r>
       <w:r>
-        <w:t xml:space="preserve">Piezas blancas: rey en c3; dama en g6. Piezas negras: rey en e1. La flecha va de g6 a g2.</w:t>
+        <w:t xml:space="preserve">Piezas blancas: rey en c3; dama en g6. Piezas negras: rey en e1.</w:t>
+      </w:r>
+    </w:p>
+    <w:p>
+      <w:pPr>
+        <w:keepLines/>
+        <w:pBdr>
+          <w:top w:val="single" w:color="000000" w:sz="12" w:space="6"/>
+          <w:left w:val="single" w:color="000000" w:sz="12" w:space="6"/>
+          <w:bottom w:val="single" w:color="000000" w:sz="12" w:space="6"/>
+          <w:right w:val="single" w:color="000000" w:sz="12" w:space="6"/>
+        </w:pBdr>
+      </w:pPr>
+      <w:r>
+        <w:rPr>
+          <w:b/>
+          <w:bCs/>
+        </w:rPr>
+        <w:t xml:space="preserve">Con las manos. </w:t>
+      </w:r>
+      <w:r>
+        <w:t xml:space="preserve">Arma esta posición en tu tablero. Con el dedo, sigue el camino de g6 a g2.</w:t>
       </w:r>
     </w:p>
     <w:p>
@@ -6222,7 +7041,7 @@
       <w:r>
         <w:drawing>
           <wp:inline distT="0" distB="0" distL="0" distR="0">
-            <wp:extent cx="3887986" cy="3887986"/>
+            <wp:extent cx="3239988" cy="3239988"/>
             <wp:effectExtent t="0" r="0" b="0" l="0"/>
             <wp:docPr id="1" name="Dibujo decorativo" descr="" title="">
               <a:extLst xmlns:a="http://schemas.openxmlformats.org/drawingml/2006/main">
@@ -6253,7 +7072,7 @@
                   <pic:spPr bwMode="auto">
                     <a:xfrm>
                       <a:off x="0" y="0"/>
-                      <a:ext cx="3887986" cy="3887986"/>
+                      <a:ext cx="3239988" cy="3239988"/>
                     </a:xfrm>
                     <a:prstGeom prst="rect">
                       <a:avLst/>
@@ -6292,6 +7111,28 @@
       <w:pPr>
         <w:keepNext/>
         <w:keepLines/>
+        <w:pBdr>
+          <w:top w:val="single" w:color="000000" w:sz="12" w:space="6"/>
+          <w:left w:val="single" w:color="000000" w:sz="12" w:space="6"/>
+          <w:bottom w:val="single" w:color="000000" w:sz="12" w:space="6"/>
+          <w:right w:val="single" w:color="000000" w:sz="12" w:space="6"/>
+        </w:pBdr>
+      </w:pPr>
+      <w:r>
+        <w:rPr>
+          <w:b/>
+          <w:bCs/>
+        </w:rPr>
+        <w:t xml:space="preserve">Con las manos. </w:t>
+      </w:r>
+      <w:r>
+        <w:t xml:space="preserve">Arma esta posición en tu tablero. Prueba con tus piezas: haz la primera jugada, contesta por las negras y busca el mate.</w:t>
+      </w:r>
+    </w:p>
+    <w:p>
+      <w:pPr>
+        <w:keepNext/>
+        <w:keepLines/>
       </w:pPr>
       <w:r>
         <w:rPr>
@@ -6339,7 +7180,7 @@
       <w:r>
         <w:drawing>
           <wp:inline distT="0" distB="0" distL="0" distR="0">
-            <wp:extent cx="3887986" cy="3887986"/>
+            <wp:extent cx="3239988" cy="3239988"/>
             <wp:effectExtent t="0" r="0" b="0" l="0"/>
             <wp:docPr id="1" name="Dibujo decorativo" descr="" title="">
               <a:extLst xmlns:a="http://schemas.openxmlformats.org/drawingml/2006/main">
@@ -6370,7 +7211,7 @@
                   <pic:spPr bwMode="auto">
                     <a:xfrm>
                       <a:off x="0" y="0"/>
-                      <a:ext cx="3887986" cy="3887986"/>
+                      <a:ext cx="3239988" cy="3239988"/>
                     </a:xfrm>
                     <a:prstGeom prst="rect">
                       <a:avLst/>
@@ -6409,6 +7250,28 @@
       <w:pPr>
         <w:keepNext/>
         <w:keepLines/>
+        <w:pBdr>
+          <w:top w:val="single" w:color="000000" w:sz="12" w:space="6"/>
+          <w:left w:val="single" w:color="000000" w:sz="12" w:space="6"/>
+          <w:bottom w:val="single" w:color="000000" w:sz="12" w:space="6"/>
+          <w:right w:val="single" w:color="000000" w:sz="12" w:space="6"/>
+        </w:pBdr>
+      </w:pPr>
+      <w:r>
+        <w:rPr>
+          <w:b/>
+          <w:bCs/>
+        </w:rPr>
+        <w:t xml:space="preserve">Con las manos. </w:t>
+      </w:r>
+      <w:r>
+        <w:t xml:space="preserve">Arma esta posición en tu tablero. Prueba con tus piezas: haz la primera jugada, contesta por las negras y busca el mate.</w:t>
+      </w:r>
+    </w:p>
+    <w:p>
+      <w:pPr>
+        <w:keepNext/>
+        <w:keepLines/>
       </w:pPr>
       <w:r>
         <w:rPr>
@@ -6456,7 +7319,7 @@
       <w:r>
         <w:drawing>
           <wp:inline distT="0" distB="0" distL="0" distR="0">
-            <wp:extent cx="3887986" cy="3887986"/>
+            <wp:extent cx="3239988" cy="3239988"/>
             <wp:effectExtent t="0" r="0" b="0" l="0"/>
             <wp:docPr id="1" name="Dibujo decorativo" descr="" title="">
               <a:extLst xmlns:a="http://schemas.openxmlformats.org/drawingml/2006/main">
@@ -6487,7 +7350,7 @@
                   <pic:spPr bwMode="auto">
                     <a:xfrm>
                       <a:off x="0" y="0"/>
-                      <a:ext cx="3887986" cy="3887986"/>
+                      <a:ext cx="3239988" cy="3239988"/>
                     </a:xfrm>
                     <a:prstGeom prst="rect">
                       <a:avLst/>
@@ -6520,6 +7383,28 @@
       </w:r>
       <w:r>
         <w:t xml:space="preserve">Piezas blancas: rey en c4; dama en f8. Piezas negras: rey en a1.</w:t>
+      </w:r>
+    </w:p>
+    <w:p>
+      <w:pPr>
+        <w:keepNext/>
+        <w:keepLines/>
+        <w:pBdr>
+          <w:top w:val="single" w:color="000000" w:sz="12" w:space="6"/>
+          <w:left w:val="single" w:color="000000" w:sz="12" w:space="6"/>
+          <w:bottom w:val="single" w:color="000000" w:sz="12" w:space="6"/>
+          <w:right w:val="single" w:color="000000" w:sz="12" w:space="6"/>
+        </w:pBdr>
+      </w:pPr>
+      <w:r>
+        <w:rPr>
+          <w:b/>
+          <w:bCs/>
+        </w:rPr>
+        <w:t xml:space="preserve">Con las manos. </w:t>
+      </w:r>
+      <w:r>
+        <w:t xml:space="preserve">Arma esta posición en tu tablero. Prueba con tus piezas: haz la primera jugada, contesta por las negras y busca el mate.</w:t>
       </w:r>
     </w:p>
     <w:p>
@@ -6827,7 +7712,7 @@
       <w:r>
         <w:drawing>
           <wp:inline distT="0" distB="0" distL="0" distR="0">
-            <wp:extent cx="3887986" cy="3887986"/>
+            <wp:extent cx="3239988" cy="3239988"/>
             <wp:effectExtent t="0" r="0" b="0" l="0"/>
             <wp:docPr id="1" name="Dibujo decorativo" descr="" title="">
               <a:extLst xmlns:a="http://schemas.openxmlformats.org/drawingml/2006/main">
@@ -6858,7 +7743,7 @@
                   <pic:spPr bwMode="auto">
                     <a:xfrm>
                       <a:off x="0" y="0"/>
-                      <a:ext cx="3887986" cy="3887986"/>
+                      <a:ext cx="3239988" cy="3239988"/>
                     </a:xfrm>
                     <a:prstGeom prst="rect">
                       <a:avLst/>
@@ -6897,6 +7782,28 @@
       <w:pPr>
         <w:keepNext/>
         <w:keepLines/>
+        <w:pBdr>
+          <w:top w:val="single" w:color="000000" w:sz="12" w:space="6"/>
+          <w:left w:val="single" w:color="000000" w:sz="12" w:space="6"/>
+          <w:bottom w:val="single" w:color="000000" w:sz="12" w:space="6"/>
+          <w:right w:val="single" w:color="000000" w:sz="12" w:space="6"/>
+        </w:pBdr>
+      </w:pPr>
+      <w:r>
+        <w:rPr>
+          <w:b/>
+          <w:bCs/>
+        </w:rPr>
+        <w:t xml:space="preserve">Con las manos. </w:t>
+      </w:r>
+      <w:r>
+        <w:t xml:space="preserve">Arma esta posición en tu tablero. Prueba con tus piezas las jugadas de las blancas. Después de cada una, toca las casillas de alrededor del rey negro: ¿puede escapar a alguna?</w:t>
+      </w:r>
+    </w:p>
+    <w:p>
+      <w:pPr>
+        <w:keepNext/>
+        <w:keepLines/>
       </w:pPr>
       <w:r>
         <w:rPr>
@@ -6944,7 +7851,7 @@
       <w:r>
         <w:drawing>
           <wp:inline distT="0" distB="0" distL="0" distR="0">
-            <wp:extent cx="3887986" cy="3887986"/>
+            <wp:extent cx="3239988" cy="3239988"/>
             <wp:effectExtent t="0" r="0" b="0" l="0"/>
             <wp:docPr id="1" name="Dibujo decorativo" descr="" title="">
               <a:extLst xmlns:a="http://schemas.openxmlformats.org/drawingml/2006/main">
@@ -6975,7 +7882,7 @@
                   <pic:spPr bwMode="auto">
                     <a:xfrm>
                       <a:off x="0" y="0"/>
-                      <a:ext cx="3887986" cy="3887986"/>
+                      <a:ext cx="3239988" cy="3239988"/>
                     </a:xfrm>
                     <a:prstGeom prst="rect">
                       <a:avLst/>
@@ -7014,6 +7921,28 @@
       <w:pPr>
         <w:keepNext/>
         <w:keepLines/>
+        <w:pBdr>
+          <w:top w:val="single" w:color="000000" w:sz="12" w:space="6"/>
+          <w:left w:val="single" w:color="000000" w:sz="12" w:space="6"/>
+          <w:bottom w:val="single" w:color="000000" w:sz="12" w:space="6"/>
+          <w:right w:val="single" w:color="000000" w:sz="12" w:space="6"/>
+        </w:pBdr>
+      </w:pPr>
+      <w:r>
+        <w:rPr>
+          <w:b/>
+          <w:bCs/>
+        </w:rPr>
+        <w:t xml:space="preserve">Con las manos. </w:t>
+      </w:r>
+      <w:r>
+        <w:t xml:space="preserve">Arma esta posición en tu tablero. Prueba con tus piezas las jugadas de las blancas. Después de cada una, toca las casillas de alrededor del rey negro: ¿puede escapar a alguna?</w:t>
+      </w:r>
+    </w:p>
+    <w:p>
+      <w:pPr>
+        <w:keepNext/>
+        <w:keepLines/>
       </w:pPr>
       <w:r>
         <w:rPr>
@@ -7061,7 +7990,7 @@
       <w:r>
         <w:drawing>
           <wp:inline distT="0" distB="0" distL="0" distR="0">
-            <wp:extent cx="3887986" cy="3887986"/>
+            <wp:extent cx="3239988" cy="3239988"/>
             <wp:effectExtent t="0" r="0" b="0" l="0"/>
             <wp:docPr id="1" name="Dibujo decorativo" descr="" title="">
               <a:extLst xmlns:a="http://schemas.openxmlformats.org/drawingml/2006/main">
@@ -7092,7 +8021,7 @@
                   <pic:spPr bwMode="auto">
                     <a:xfrm>
                       <a:off x="0" y="0"/>
-                      <a:ext cx="3887986" cy="3887986"/>
+                      <a:ext cx="3239988" cy="3239988"/>
                     </a:xfrm>
                     <a:prstGeom prst="rect">
                       <a:avLst/>
@@ -7131,13 +8060,35 @@
       <w:pPr>
         <w:keepNext/>
         <w:keepLines/>
-      </w:pPr>
-      <w:r>
-        <w:rPr>
-          <w:b/>
-          <w:bCs/>
-        </w:rPr>
-        <w:t xml:space="preserve">Le toca mover al rey negro. ¿Qué pasó? ¿Jaque mate, ahogado o ninguno?</w:t>
+        <w:pBdr>
+          <w:top w:val="single" w:color="000000" w:sz="12" w:space="6"/>
+          <w:left w:val="single" w:color="000000" w:sz="12" w:space="6"/>
+          <w:bottom w:val="single" w:color="000000" w:sz="12" w:space="6"/>
+          <w:right w:val="single" w:color="000000" w:sz="12" w:space="6"/>
+        </w:pBdr>
+      </w:pPr>
+      <w:r>
+        <w:rPr>
+          <w:b/>
+          <w:bCs/>
+        </w:rPr>
+        <w:t xml:space="preserve">Con las manos. </w:t>
+      </w:r>
+      <w:r>
+        <w:t xml:space="preserve">Arma esta posición en tu tablero. Toca, una por una, las casillas de alrededor del rey negro. Para cada una, busca si alguna pieza blanca llega hasta ahí.</w:t>
+      </w:r>
+    </w:p>
+    <w:p>
+      <w:pPr>
+        <w:keepNext/>
+        <w:keepLines/>
+      </w:pPr>
+      <w:r>
+        <w:rPr>
+          <w:b/>
+          <w:bCs/>
+        </w:rPr>
+        <w:t xml:space="preserve">Le toca mover al rey negro. ¿Qué pasó: jaque mate, ahogado o ninguno?</w:t>
       </w:r>
     </w:p>
     <w:p>
@@ -7178,7 +8129,7 @@
       <w:r>
         <w:drawing>
           <wp:inline distT="0" distB="0" distL="0" distR="0">
-            <wp:extent cx="3887986" cy="3887986"/>
+            <wp:extent cx="3239988" cy="3239988"/>
             <wp:effectExtent t="0" r="0" b="0" l="0"/>
             <wp:docPr id="1" name="Dibujo decorativo" descr="" title="">
               <a:extLst xmlns:a="http://schemas.openxmlformats.org/drawingml/2006/main">
@@ -7209,7 +8160,7 @@
                   <pic:spPr bwMode="auto">
                     <a:xfrm>
                       <a:off x="0" y="0"/>
-                      <a:ext cx="3887986" cy="3887986"/>
+                      <a:ext cx="3239988" cy="3239988"/>
                     </a:xfrm>
                     <a:prstGeom prst="rect">
                       <a:avLst/>
@@ -7242,6 +8193,28 @@
       </w:r>
       <w:r>
         <w:t xml:space="preserve">Piezas blancas: rey en d6; dama en h3. Piezas negras: rey en a4.</w:t>
+      </w:r>
+    </w:p>
+    <w:p>
+      <w:pPr>
+        <w:keepNext/>
+        <w:keepLines/>
+        <w:pBdr>
+          <w:top w:val="single" w:color="000000" w:sz="12" w:space="6"/>
+          <w:left w:val="single" w:color="000000" w:sz="12" w:space="6"/>
+          <w:bottom w:val="single" w:color="000000" w:sz="12" w:space="6"/>
+          <w:right w:val="single" w:color="000000" w:sz="12" w:space="6"/>
+        </w:pBdr>
+      </w:pPr>
+      <w:r>
+        <w:rPr>
+          <w:b/>
+          <w:bCs/>
+        </w:rPr>
+        <w:t xml:space="preserve">Con las manos. </w:t>
+      </w:r>
+      <w:r>
+        <w:t xml:space="preserve">Arma esta posición en tu tablero. Prueba con tus piezas: haz la primera jugada, contesta por las negras y busca el mate.</w:t>
       </w:r>
     </w:p>
     <w:p>

</xml_diff>

<commit_message>
Cuentos de Peonita para quien no ve: ejercicios con las manos y EPUB accesible (#898)
Los ejercicios de las versiones para quien no ve se hacen en un tablero táctil («Con las manos»), sin nada que solo se ve, y el libro sale también en EPUB 3 accesible (EPUBCheck y Ace by DAISY sin problemas). verificar-libro-ninos.js lo vigila.
</commit_message>
<xml_diff>
--- a/material/peonita-rey/peonita-rey-adaptado.docx
+++ b/material/peonita-rey/peonita-rey-adaptado.docx
@@ -54,7 +54,7 @@
         <w:t xml:space="preserve">Versión adaptada. </w:t>
       </w:r>
       <w:r>
-        <w:t xml:space="preserve">Es el mismo libro, hecho para quien ve poco o no ve: letra grande, negro sobre blanco, un tablero grande en cada página y todo escrito, para leerlo con lupa o con lector de pantalla. Cada dibujo va contado en palabras y cada posición, pieza por pieza.</w:t>
+        <w:t xml:space="preserve">Es el mismo libro, hecho para quien ve poco o no ve: letra grande, negro sobre blanco, un tablero grande en cada página y todo escrito, para leerlo con lupa o con lector de pantalla. Cada dibujo va contado en palabras y cada posición, pieza por pieza, y cada ejercicio dice cómo hacerlo con las manos en un tablero táctil.</w:t>
       </w:r>
     </w:p>
     <w:p>
@@ -294,6 +294,17 @@
     </w:p>
     <w:p>
       <w:pPr>
+        <w:pStyle w:val="Heading2"/>
+        <w:keepNext/>
+        <w:keepLines/>
+        <w:pageBreakBefore/>
+      </w:pPr>
+      <w:r>
+        <w:t xml:space="preserve">Para leer con las manos</w:t>
+      </w:r>
+    </w:p>
+    <w:p>
+      <w:pPr>
         <w:keepLines/>
       </w:pPr>
       <w:r>
@@ -301,7 +312,67 @@
           <w:b w:val="false"/>
           <w:bCs w:val="false"/>
         </w:rPr>
-        <w:t xml:space="preserve">Oscar Angulo Cubero</w:t>
+        <w:t xml:space="preserve">Este libro se puede leer con un niño o una niña que no ve. Los ejercicios se hacen con las manos, en un tablero de ajedrez táctil, y se contestan en voz alta: usted lee, el niño arma, toca y responde.</w:t>
+      </w:r>
+    </w:p>
+    <w:p>
+      <w:pPr>
+        <w:keepLines/>
+      </w:pPr>
+      <w:r>
+        <w:rPr>
+          <w:b w:val="false"/>
+          <w:bCs w:val="false"/>
+        </w:rPr>
+        <w:t xml:space="preserve">En la mayoría de los tableros táctiles, las casillas oscuras son más altas que las claras, y cada pieza entra en un agujero para que no se caiga al tocarla. Las piezas negras tienen una puntita o un clavito arriba; así se distinguen de las blancas.</w:t>
+      </w:r>
+    </w:p>
+    <w:p>
+      <w:pPr>
+        <w:keepLines/>
+      </w:pPr>
+      <w:r>
+        <w:rPr>
+          <w:b w:val="false"/>
+          <w:bCs w:val="false"/>
+        </w:rPr>
+        <w:t xml:space="preserve">Tenga a mano unos botones o monedas: son las «fichas». Donde el libro con dibujos tiene una estrella, usted pone una ficha en esa casilla.</w:t>
+      </w:r>
+    </w:p>
+    <w:p>
+      <w:pPr>
+        <w:keepLines/>
+      </w:pPr>
+      <w:r>
+        <w:rPr>
+          <w:b w:val="false"/>
+          <w:bCs w:val="false"/>
+        </w:rPr>
+        <w:t xml:space="preserve">Cada ejercicio empieza con «Con las manos»: qué piezas poner y qué tocar. La posición viene escrita pieza por pieza: primero las blancas y después las negras. Arme la posición con el niño, no por él: buscar la casilla también es aprender.</w:t>
+      </w:r>
+    </w:p>
+    <w:p>
+      <w:pPr>
+        <w:keepLines/>
+      </w:pPr>
+      <w:r>
+        <w:rPr>
+          <w:b w:val="false"/>
+          <w:bCs w:val="false"/>
+        </w:rPr>
+        <w:t xml:space="preserve">Las casillas se nombran con una letra y un número: la letra dice la columna, contando desde la izquierda (a, b, c… hasta h), y el número dice la fila, contando desde abajo (1 hasta 8). El niño se sienta del lado de las piezas blancas.</w:t>
+      </w:r>
+    </w:p>
+    <w:p>
+      <w:pPr>
+        <w:keepLines/>
+      </w:pPr>
+      <w:r>
+        <w:rPr>
+          <w:b w:val="false"/>
+          <w:bCs w:val="false"/>
+        </w:rPr>
+        <w:t xml:space="preserve">Antes de empezar, recorran juntos el tablero: las orillas, las cuatro esquinas, una fila de izquierda a derecha y una columna de abajo hacia arriba.</w:t>
       </w:r>
     </w:p>
     <w:p>
@@ -689,7 +760,7 @@
       <w:r>
         <w:drawing>
           <wp:inline distT="0" distB="0" distL="0" distR="0">
-            <wp:extent cx="5399931" cy="5399931"/>
+            <wp:extent cx="4319885" cy="4319885"/>
             <wp:effectExtent t="0" r="0" b="0" l="0"/>
             <wp:docPr id="1" name="Dibujo decorativo" descr="" title="">
               <a:extLst xmlns:a="http://schemas.openxmlformats.org/drawingml/2006/main">
@@ -720,7 +791,7 @@
                   <pic:spPr bwMode="auto">
                     <a:xfrm>
                       <a:off x="0" y="0"/>
-                      <a:ext cx="5399931" cy="5399931"/>
+                      <a:ext cx="4319885" cy="4319885"/>
                     </a:xfrm>
                     <a:prstGeom prst="rect">
                       <a:avLst/>
@@ -748,6 +819,7 @@
     </w:p>
     <w:p>
       <w:pPr>
+        <w:keepNext/>
         <w:keepLines/>
         <w:pBdr>
           <w:top w:val="single" w:color="000000" w:sz="12" w:space="6"/>
@@ -764,7 +836,28 @@
         <w:t xml:space="preserve">La posición. </w:t>
       </w:r>
       <w:r>
-        <w:t xml:space="preserve">Piezas blancas: rey en e6; torre en a8. Piezas negras: rey en e8. La flecha va de a8 a e8.</w:t>
+        <w:t xml:space="preserve">Piezas blancas: rey en e6; torre en a8. Piezas negras: rey en e8.</w:t>
+      </w:r>
+    </w:p>
+    <w:p>
+      <w:pPr>
+        <w:keepLines/>
+        <w:pBdr>
+          <w:top w:val="single" w:color="000000" w:sz="12" w:space="6"/>
+          <w:left w:val="single" w:color="000000" w:sz="12" w:space="6"/>
+          <w:bottom w:val="single" w:color="000000" w:sz="12" w:space="6"/>
+          <w:right w:val="single" w:color="000000" w:sz="12" w:space="6"/>
+        </w:pBdr>
+      </w:pPr>
+      <w:r>
+        <w:rPr>
+          <w:b/>
+          <w:bCs/>
+        </w:rPr>
+        <w:t xml:space="preserve">Con las manos. </w:t>
+      </w:r>
+      <w:r>
+        <w:t xml:space="preserve">Arma esta posición en tu tablero. Con el dedo, sigue el camino de a8 a e8.</w:t>
       </w:r>
     </w:p>
     <w:p>
@@ -848,7 +941,7 @@
       <w:r>
         <w:drawing>
           <wp:inline distT="0" distB="0" distL="0" distR="0">
-            <wp:extent cx="3887986" cy="3887986"/>
+            <wp:extent cx="3239988" cy="3239988"/>
             <wp:effectExtent t="0" r="0" b="0" l="0"/>
             <wp:docPr id="1" name="Dibujo decorativo" descr="" title="">
               <a:extLst xmlns:a="http://schemas.openxmlformats.org/drawingml/2006/main">
@@ -879,7 +972,7 @@
                   <pic:spPr bwMode="auto">
                     <a:xfrm>
                       <a:off x="0" y="0"/>
-                      <a:ext cx="3887986" cy="3887986"/>
+                      <a:ext cx="3239988" cy="3239988"/>
                     </a:xfrm>
                     <a:prstGeom prst="rect">
                       <a:avLst/>
@@ -918,6 +1011,28 @@
       <w:pPr>
         <w:keepNext/>
         <w:keepLines/>
+        <w:pBdr>
+          <w:top w:val="single" w:color="000000" w:sz="12" w:space="6"/>
+          <w:left w:val="single" w:color="000000" w:sz="12" w:space="6"/>
+          <w:bottom w:val="single" w:color="000000" w:sz="12" w:space="6"/>
+          <w:right w:val="single" w:color="000000" w:sz="12" w:space="6"/>
+        </w:pBdr>
+      </w:pPr>
+      <w:r>
+        <w:rPr>
+          <w:b/>
+          <w:bCs/>
+        </w:rPr>
+        <w:t xml:space="preserve">Con las manos. </w:t>
+      </w:r>
+      <w:r>
+        <w:t xml:space="preserve">Arma esta posición en tu tablero. Sigue con el dedo los caminos de cada pieza negra, una por una, y fíjate si alguna llega al rey blanco.</w:t>
+      </w:r>
+    </w:p>
+    <w:p>
+      <w:pPr>
+        <w:keepNext/>
+        <w:keepLines/>
       </w:pPr>
       <w:r>
         <w:rPr>
@@ -965,7 +1080,7 @@
       <w:r>
         <w:drawing>
           <wp:inline distT="0" distB="0" distL="0" distR="0">
-            <wp:extent cx="3887986" cy="3887986"/>
+            <wp:extent cx="3239988" cy="3239988"/>
             <wp:effectExtent t="0" r="0" b="0" l="0"/>
             <wp:docPr id="1" name="Dibujo decorativo" descr="" title="">
               <a:extLst xmlns:a="http://schemas.openxmlformats.org/drawingml/2006/main">
@@ -996,7 +1111,7 @@
                   <pic:spPr bwMode="auto">
                     <a:xfrm>
                       <a:off x="0" y="0"/>
-                      <a:ext cx="3887986" cy="3887986"/>
+                      <a:ext cx="3239988" cy="3239988"/>
                     </a:xfrm>
                     <a:prstGeom prst="rect">
                       <a:avLst/>
@@ -1035,13 +1150,35 @@
       <w:pPr>
         <w:keepNext/>
         <w:keepLines/>
-      </w:pPr>
-      <w:r>
-        <w:rPr>
-          <w:b/>
-          <w:bCs/>
-        </w:rPr>
-        <w:t xml:space="preserve">Le toca mover al rey negro. ¿Qué pasó? ¿Jaque mate, ahogado o ninguno?</w:t>
+        <w:pBdr>
+          <w:top w:val="single" w:color="000000" w:sz="12" w:space="6"/>
+          <w:left w:val="single" w:color="000000" w:sz="12" w:space="6"/>
+          <w:bottom w:val="single" w:color="000000" w:sz="12" w:space="6"/>
+          <w:right w:val="single" w:color="000000" w:sz="12" w:space="6"/>
+        </w:pBdr>
+      </w:pPr>
+      <w:r>
+        <w:rPr>
+          <w:b/>
+          <w:bCs/>
+        </w:rPr>
+        <w:t xml:space="preserve">Con las manos. </w:t>
+      </w:r>
+      <w:r>
+        <w:t xml:space="preserve">Arma esta posición en tu tablero. Toca, una por una, las casillas de alrededor del rey negro. Para cada una, busca si alguna pieza blanca llega hasta ahí.</w:t>
+      </w:r>
+    </w:p>
+    <w:p>
+      <w:pPr>
+        <w:keepNext/>
+        <w:keepLines/>
+      </w:pPr>
+      <w:r>
+        <w:rPr>
+          <w:b/>
+          <w:bCs/>
+        </w:rPr>
+        <w:t xml:space="preserve">Le toca mover al rey negro. ¿Qué pasó: jaque mate, ahogado o ninguno?</w:t>
       </w:r>
     </w:p>
     <w:p>
@@ -1082,7 +1219,7 @@
       <w:r>
         <w:drawing>
           <wp:inline distT="0" distB="0" distL="0" distR="0">
-            <wp:extent cx="3887986" cy="3887986"/>
+            <wp:extent cx="3239988" cy="3239988"/>
             <wp:effectExtent t="0" r="0" b="0" l="0"/>
             <wp:docPr id="1" name="Dibujo decorativo" descr="" title="">
               <a:extLst xmlns:a="http://schemas.openxmlformats.org/drawingml/2006/main">
@@ -1113,7 +1250,7 @@
                   <pic:spPr bwMode="auto">
                     <a:xfrm>
                       <a:off x="0" y="0"/>
-                      <a:ext cx="3887986" cy="3887986"/>
+                      <a:ext cx="3239988" cy="3239988"/>
                     </a:xfrm>
                     <a:prstGeom prst="rect">
                       <a:avLst/>
@@ -1152,13 +1289,35 @@
       <w:pPr>
         <w:keepNext/>
         <w:keepLines/>
-      </w:pPr>
-      <w:r>
-        <w:rPr>
-          <w:b/>
-          <w:bCs/>
-        </w:rPr>
-        <w:t xml:space="preserve">Le toca mover al rey negro. ¿Qué pasó? ¿Jaque mate, ahogado o ninguno?</w:t>
+        <w:pBdr>
+          <w:top w:val="single" w:color="000000" w:sz="12" w:space="6"/>
+          <w:left w:val="single" w:color="000000" w:sz="12" w:space="6"/>
+          <w:bottom w:val="single" w:color="000000" w:sz="12" w:space="6"/>
+          <w:right w:val="single" w:color="000000" w:sz="12" w:space="6"/>
+        </w:pBdr>
+      </w:pPr>
+      <w:r>
+        <w:rPr>
+          <w:b/>
+          <w:bCs/>
+        </w:rPr>
+        <w:t xml:space="preserve">Con las manos. </w:t>
+      </w:r>
+      <w:r>
+        <w:t xml:space="preserve">Arma esta posición en tu tablero. Toca, una por una, las casillas de alrededor del rey negro. Para cada una, busca si alguna pieza blanca llega hasta ahí.</w:t>
+      </w:r>
+    </w:p>
+    <w:p>
+      <w:pPr>
+        <w:keepNext/>
+        <w:keepLines/>
+      </w:pPr>
+      <w:r>
+        <w:rPr>
+          <w:b/>
+          <w:bCs/>
+        </w:rPr>
+        <w:t xml:space="preserve">Le toca mover al rey negro. ¿Qué pasó: jaque mate, ahogado o ninguno?</w:t>
       </w:r>
     </w:p>
     <w:p>
@@ -1199,7 +1358,7 @@
       <w:r>
         <w:drawing>
           <wp:inline distT="0" distB="0" distL="0" distR="0">
-            <wp:extent cx="3887986" cy="3887986"/>
+            <wp:extent cx="3239988" cy="3239988"/>
             <wp:effectExtent t="0" r="0" b="0" l="0"/>
             <wp:docPr id="1" name="Dibujo decorativo" descr="" title="">
               <a:extLst xmlns:a="http://schemas.openxmlformats.org/drawingml/2006/main">
@@ -1230,7 +1389,7 @@
                   <pic:spPr bwMode="auto">
                     <a:xfrm>
                       <a:off x="0" y="0"/>
-                      <a:ext cx="3887986" cy="3887986"/>
+                      <a:ext cx="3239988" cy="3239988"/>
                     </a:xfrm>
                     <a:prstGeom prst="rect">
                       <a:avLst/>
@@ -1263,6 +1422,28 @@
       </w:r>
       <w:r>
         <w:t xml:space="preserve">Piezas blancas: rey en g6; torre en a1. Piezas negras: rey en h8.</w:t>
+      </w:r>
+    </w:p>
+    <w:p>
+      <w:pPr>
+        <w:keepNext/>
+        <w:keepLines/>
+        <w:pBdr>
+          <w:top w:val="single" w:color="000000" w:sz="12" w:space="6"/>
+          <w:left w:val="single" w:color="000000" w:sz="12" w:space="6"/>
+          <w:bottom w:val="single" w:color="000000" w:sz="12" w:space="6"/>
+          <w:right w:val="single" w:color="000000" w:sz="12" w:space="6"/>
+        </w:pBdr>
+      </w:pPr>
+      <w:r>
+        <w:rPr>
+          <w:b/>
+          <w:bCs/>
+        </w:rPr>
+        <w:t xml:space="preserve">Con las manos. </w:t>
+      </w:r>
+      <w:r>
+        <w:t xml:space="preserve">Arma esta posición en tu tablero. Prueba con tus piezas las jugadas de las blancas. Después de cada una, toca las casillas de alrededor del rey negro: ¿puede escapar a alguna?</w:t>
       </w:r>
     </w:p>
     <w:p>
@@ -1485,7 +1666,7 @@
       <w:r>
         <w:drawing>
           <wp:inline distT="0" distB="0" distL="0" distR="0">
-            <wp:extent cx="5399931" cy="5399931"/>
+            <wp:extent cx="4319885" cy="4319885"/>
             <wp:effectExtent t="0" r="0" b="0" l="0"/>
             <wp:docPr id="1" name="Dibujo decorativo" descr="" title="">
               <a:extLst xmlns:a="http://schemas.openxmlformats.org/drawingml/2006/main">
@@ -1516,7 +1697,7 @@
                   <pic:spPr bwMode="auto">
                     <a:xfrm>
                       <a:off x="0" y="0"/>
-                      <a:ext cx="5399931" cy="5399931"/>
+                      <a:ext cx="4319885" cy="4319885"/>
                     </a:xfrm>
                     <a:prstGeom prst="rect">
                       <a:avLst/>
@@ -1544,6 +1725,7 @@
     </w:p>
     <w:p>
       <w:pPr>
+        <w:keepNext/>
         <w:keepLines/>
         <w:pBdr>
           <w:top w:val="single" w:color="000000" w:sz="12" w:space="6"/>
@@ -1560,7 +1742,28 @@
         <w:t xml:space="preserve">La posición. </w:t>
       </w:r>
       <w:r>
-        <w:t xml:space="preserve">Piezas blancas: rey en e6; torre en a1. Piezas negras: rey en e8. La flecha va de a1 a a8.</w:t>
+        <w:t xml:space="preserve">Piezas blancas: rey en e6; torre en a1. Piezas negras: rey en e8.</w:t>
+      </w:r>
+    </w:p>
+    <w:p>
+      <w:pPr>
+        <w:keepLines/>
+        <w:pBdr>
+          <w:top w:val="single" w:color="000000" w:sz="12" w:space="6"/>
+          <w:left w:val="single" w:color="000000" w:sz="12" w:space="6"/>
+          <w:bottom w:val="single" w:color="000000" w:sz="12" w:space="6"/>
+          <w:right w:val="single" w:color="000000" w:sz="12" w:space="6"/>
+        </w:pBdr>
+      </w:pPr>
+      <w:r>
+        <w:rPr>
+          <w:b/>
+          <w:bCs/>
+        </w:rPr>
+        <w:t xml:space="preserve">Con las manos. </w:t>
+      </w:r>
+      <w:r>
+        <w:t xml:space="preserve">Arma esta posición en tu tablero. Con el dedo, sigue el camino de a1 a a8.</w:t>
       </w:r>
     </w:p>
     <w:p>
@@ -1644,7 +1847,7 @@
       <w:r>
         <w:drawing>
           <wp:inline distT="0" distB="0" distL="0" distR="0">
-            <wp:extent cx="3887986" cy="3887986"/>
+            <wp:extent cx="3239988" cy="3239988"/>
             <wp:effectExtent t="0" r="0" b="0" l="0"/>
             <wp:docPr id="1" name="Dibujo decorativo" descr="" title="">
               <a:extLst xmlns:a="http://schemas.openxmlformats.org/drawingml/2006/main">
@@ -1675,7 +1878,7 @@
                   <pic:spPr bwMode="auto">
                     <a:xfrm>
                       <a:off x="0" y="0"/>
-                      <a:ext cx="3887986" cy="3887986"/>
+                      <a:ext cx="3239988" cy="3239988"/>
                     </a:xfrm>
                     <a:prstGeom prst="rect">
                       <a:avLst/>
@@ -1714,6 +1917,28 @@
       <w:pPr>
         <w:keepNext/>
         <w:keepLines/>
+        <w:pBdr>
+          <w:top w:val="single" w:color="000000" w:sz="12" w:space="6"/>
+          <w:left w:val="single" w:color="000000" w:sz="12" w:space="6"/>
+          <w:bottom w:val="single" w:color="000000" w:sz="12" w:space="6"/>
+          <w:right w:val="single" w:color="000000" w:sz="12" w:space="6"/>
+        </w:pBdr>
+      </w:pPr>
+      <w:r>
+        <w:rPr>
+          <w:b/>
+          <w:bCs/>
+        </w:rPr>
+        <w:t xml:space="preserve">Con las manos. </w:t>
+      </w:r>
+      <w:r>
+        <w:t xml:space="preserve">Arma esta posición en tu tablero. Prueba con tus piezas las jugadas de las blancas. Después de cada una, toca las casillas de alrededor del rey negro: ¿puede escapar a alguna?</w:t>
+      </w:r>
+    </w:p>
+    <w:p>
+      <w:pPr>
+        <w:keepNext/>
+        <w:keepLines/>
       </w:pPr>
       <w:r>
         <w:rPr>
@@ -1761,7 +1986,7 @@
       <w:r>
         <w:drawing>
           <wp:inline distT="0" distB="0" distL="0" distR="0">
-            <wp:extent cx="3887986" cy="3887986"/>
+            <wp:extent cx="3239988" cy="3239988"/>
             <wp:effectExtent t="0" r="0" b="0" l="0"/>
             <wp:docPr id="1" name="Dibujo decorativo" descr="" title="">
               <a:extLst xmlns:a="http://schemas.openxmlformats.org/drawingml/2006/main">
@@ -1792,7 +2017,7 @@
                   <pic:spPr bwMode="auto">
                     <a:xfrm>
                       <a:off x="0" y="0"/>
-                      <a:ext cx="3887986" cy="3887986"/>
+                      <a:ext cx="3239988" cy="3239988"/>
                     </a:xfrm>
                     <a:prstGeom prst="rect">
                       <a:avLst/>
@@ -1831,6 +2056,28 @@
       <w:pPr>
         <w:keepNext/>
         <w:keepLines/>
+        <w:pBdr>
+          <w:top w:val="single" w:color="000000" w:sz="12" w:space="6"/>
+          <w:left w:val="single" w:color="000000" w:sz="12" w:space="6"/>
+          <w:bottom w:val="single" w:color="000000" w:sz="12" w:space="6"/>
+          <w:right w:val="single" w:color="000000" w:sz="12" w:space="6"/>
+        </w:pBdr>
+      </w:pPr>
+      <w:r>
+        <w:rPr>
+          <w:b/>
+          <w:bCs/>
+        </w:rPr>
+        <w:t xml:space="preserve">Con las manos. </w:t>
+      </w:r>
+      <w:r>
+        <w:t xml:space="preserve">Arma esta posición en tu tablero. Prueba con tus piezas las jugadas de las blancas. Después de cada una, toca las casillas de alrededor del rey negro: ¿puede escapar a alguna?</w:t>
+      </w:r>
+    </w:p>
+    <w:p>
+      <w:pPr>
+        <w:keepNext/>
+        <w:keepLines/>
       </w:pPr>
       <w:r>
         <w:rPr>
@@ -1878,7 +2125,7 @@
       <w:r>
         <w:drawing>
           <wp:inline distT="0" distB="0" distL="0" distR="0">
-            <wp:extent cx="3887986" cy="3887986"/>
+            <wp:extent cx="3239988" cy="3239988"/>
             <wp:effectExtent t="0" r="0" b="0" l="0"/>
             <wp:docPr id="1" name="Dibujo decorativo" descr="" title="">
               <a:extLst xmlns:a="http://schemas.openxmlformats.org/drawingml/2006/main">
@@ -1909,7 +2156,7 @@
                   <pic:spPr bwMode="auto">
                     <a:xfrm>
                       <a:off x="0" y="0"/>
-                      <a:ext cx="3887986" cy="3887986"/>
+                      <a:ext cx="3239988" cy="3239988"/>
                     </a:xfrm>
                     <a:prstGeom prst="rect">
                       <a:avLst/>
@@ -1948,6 +2195,28 @@
       <w:pPr>
         <w:keepNext/>
         <w:keepLines/>
+        <w:pBdr>
+          <w:top w:val="single" w:color="000000" w:sz="12" w:space="6"/>
+          <w:left w:val="single" w:color="000000" w:sz="12" w:space="6"/>
+          <w:bottom w:val="single" w:color="000000" w:sz="12" w:space="6"/>
+          <w:right w:val="single" w:color="000000" w:sz="12" w:space="6"/>
+        </w:pBdr>
+      </w:pPr>
+      <w:r>
+        <w:rPr>
+          <w:b/>
+          <w:bCs/>
+        </w:rPr>
+        <w:t xml:space="preserve">Con las manos. </w:t>
+      </w:r>
+      <w:r>
+        <w:t xml:space="preserve">Arma esta posición en tu tablero. Prueba con tus piezas las jugadas de las blancas. Después de cada una, toca las casillas de alrededor del rey negro: ¿puede escapar a alguna?</w:t>
+      </w:r>
+    </w:p>
+    <w:p>
+      <w:pPr>
+        <w:keepNext/>
+        <w:keepLines/>
       </w:pPr>
       <w:r>
         <w:rPr>
@@ -1995,7 +2264,7 @@
       <w:r>
         <w:drawing>
           <wp:inline distT="0" distB="0" distL="0" distR="0">
-            <wp:extent cx="3887986" cy="3887986"/>
+            <wp:extent cx="3239988" cy="3239988"/>
             <wp:effectExtent t="0" r="0" b="0" l="0"/>
             <wp:docPr id="1" name="Dibujo decorativo" descr="" title="">
               <a:extLst xmlns:a="http://schemas.openxmlformats.org/drawingml/2006/main">
@@ -2026,7 +2295,7 @@
                   <pic:spPr bwMode="auto">
                     <a:xfrm>
                       <a:off x="0" y="0"/>
-                      <a:ext cx="3887986" cy="3887986"/>
+                      <a:ext cx="3239988" cy="3239988"/>
                     </a:xfrm>
                     <a:prstGeom prst="rect">
                       <a:avLst/>
@@ -2065,13 +2334,35 @@
       <w:pPr>
         <w:keepNext/>
         <w:keepLines/>
-      </w:pPr>
-      <w:r>
-        <w:rPr>
-          <w:b/>
-          <w:bCs/>
-        </w:rPr>
-        <w:t xml:space="preserve">Le toca mover al rey negro. ¿Qué pasó? ¿Jaque mate, ahogado o ninguno?</w:t>
+        <w:pBdr>
+          <w:top w:val="single" w:color="000000" w:sz="12" w:space="6"/>
+          <w:left w:val="single" w:color="000000" w:sz="12" w:space="6"/>
+          <w:bottom w:val="single" w:color="000000" w:sz="12" w:space="6"/>
+          <w:right w:val="single" w:color="000000" w:sz="12" w:space="6"/>
+        </w:pBdr>
+      </w:pPr>
+      <w:r>
+        <w:rPr>
+          <w:b/>
+          <w:bCs/>
+        </w:rPr>
+        <w:t xml:space="preserve">Con las manos. </w:t>
+      </w:r>
+      <w:r>
+        <w:t xml:space="preserve">Arma esta posición en tu tablero. Toca, una por una, las casillas de alrededor del rey negro. Para cada una, busca si alguna pieza blanca llega hasta ahí.</w:t>
+      </w:r>
+    </w:p>
+    <w:p>
+      <w:pPr>
+        <w:keepNext/>
+        <w:keepLines/>
+      </w:pPr>
+      <w:r>
+        <w:rPr>
+          <w:b/>
+          <w:bCs/>
+        </w:rPr>
+        <w:t xml:space="preserve">Le toca mover al rey negro. ¿Qué pasó: jaque mate, ahogado o ninguno?</w:t>
       </w:r>
     </w:p>
     <w:p>
@@ -2293,7 +2584,7 @@
       <w:r>
         <w:drawing>
           <wp:inline distT="0" distB="0" distL="0" distR="0">
-            <wp:extent cx="5399931" cy="5399931"/>
+            <wp:extent cx="4319885" cy="4319885"/>
             <wp:effectExtent t="0" r="0" b="0" l="0"/>
             <wp:docPr id="1" name="Dibujo decorativo" descr="" title="">
               <a:extLst xmlns:a="http://schemas.openxmlformats.org/drawingml/2006/main">
@@ -2324,7 +2615,7 @@
                   <pic:spPr bwMode="auto">
                     <a:xfrm>
                       <a:off x="0" y="0"/>
-                      <a:ext cx="5399931" cy="5399931"/>
+                      <a:ext cx="4319885" cy="4319885"/>
                     </a:xfrm>
                     <a:prstGeom prst="rect">
                       <a:avLst/>
@@ -2352,6 +2643,7 @@
     </w:p>
     <w:p>
       <w:pPr>
+        <w:keepNext/>
         <w:keepLines/>
         <w:pBdr>
           <w:top w:val="single" w:color="000000" w:sz="12" w:space="6"/>
@@ -2368,7 +2660,28 @@
         <w:t xml:space="preserve">La posición. </w:t>
       </w:r>
       <w:r>
-        <w:t xml:space="preserve">Piezas blancas: rey en g1; torres en a7, b1. Piezas negras: rey en g8. La flecha va de b1 a b8.</w:t>
+        <w:t xml:space="preserve">Piezas blancas: rey en g1; torres en a7, b1. Piezas negras: rey en g8.</w:t>
+      </w:r>
+    </w:p>
+    <w:p>
+      <w:pPr>
+        <w:keepLines/>
+        <w:pBdr>
+          <w:top w:val="single" w:color="000000" w:sz="12" w:space="6"/>
+          <w:left w:val="single" w:color="000000" w:sz="12" w:space="6"/>
+          <w:bottom w:val="single" w:color="000000" w:sz="12" w:space="6"/>
+          <w:right w:val="single" w:color="000000" w:sz="12" w:space="6"/>
+        </w:pBdr>
+      </w:pPr>
+      <w:r>
+        <w:rPr>
+          <w:b/>
+          <w:bCs/>
+        </w:rPr>
+        <w:t xml:space="preserve">Con las manos. </w:t>
+      </w:r>
+      <w:r>
+        <w:t xml:space="preserve">Arma esta posición en tu tablero. Con el dedo, sigue el camino de b1 a b8.</w:t>
       </w:r>
     </w:p>
     <w:p>
@@ -2452,7 +2765,7 @@
       <w:r>
         <w:drawing>
           <wp:inline distT="0" distB="0" distL="0" distR="0">
-            <wp:extent cx="3887986" cy="3887986"/>
+            <wp:extent cx="3239988" cy="3239988"/>
             <wp:effectExtent t="0" r="0" b="0" l="0"/>
             <wp:docPr id="1" name="Dibujo decorativo" descr="" title="">
               <a:extLst xmlns:a="http://schemas.openxmlformats.org/drawingml/2006/main">
@@ -2483,7 +2796,7 @@
                   <pic:spPr bwMode="auto">
                     <a:xfrm>
                       <a:off x="0" y="0"/>
-                      <a:ext cx="3887986" cy="3887986"/>
+                      <a:ext cx="3239988" cy="3239988"/>
                     </a:xfrm>
                     <a:prstGeom prst="rect">
                       <a:avLst/>
@@ -2522,6 +2835,28 @@
       <w:pPr>
         <w:keepNext/>
         <w:keepLines/>
+        <w:pBdr>
+          <w:top w:val="single" w:color="000000" w:sz="12" w:space="6"/>
+          <w:left w:val="single" w:color="000000" w:sz="12" w:space="6"/>
+          <w:bottom w:val="single" w:color="000000" w:sz="12" w:space="6"/>
+          <w:right w:val="single" w:color="000000" w:sz="12" w:space="6"/>
+        </w:pBdr>
+      </w:pPr>
+      <w:r>
+        <w:rPr>
+          <w:b/>
+          <w:bCs/>
+        </w:rPr>
+        <w:t xml:space="preserve">Con las manos. </w:t>
+      </w:r>
+      <w:r>
+        <w:t xml:space="preserve">Arma esta posición en tu tablero. Prueba con tus piezas las jugadas de las blancas. Después de cada una, toca las casillas de alrededor del rey negro: ¿puede escapar a alguna?</w:t>
+      </w:r>
+    </w:p>
+    <w:p>
+      <w:pPr>
+        <w:keepNext/>
+        <w:keepLines/>
       </w:pPr>
       <w:r>
         <w:rPr>
@@ -2569,7 +2904,7 @@
       <w:r>
         <w:drawing>
           <wp:inline distT="0" distB="0" distL="0" distR="0">
-            <wp:extent cx="3887986" cy="3887986"/>
+            <wp:extent cx="3239988" cy="3239988"/>
             <wp:effectExtent t="0" r="0" b="0" l="0"/>
             <wp:docPr id="1" name="Dibujo decorativo" descr="" title="">
               <a:extLst xmlns:a="http://schemas.openxmlformats.org/drawingml/2006/main">
@@ -2600,7 +2935,7 @@
                   <pic:spPr bwMode="auto">
                     <a:xfrm>
                       <a:off x="0" y="0"/>
-                      <a:ext cx="3887986" cy="3887986"/>
+                      <a:ext cx="3239988" cy="3239988"/>
                     </a:xfrm>
                     <a:prstGeom prst="rect">
                       <a:avLst/>
@@ -2639,6 +2974,28 @@
       <w:pPr>
         <w:keepNext/>
         <w:keepLines/>
+        <w:pBdr>
+          <w:top w:val="single" w:color="000000" w:sz="12" w:space="6"/>
+          <w:left w:val="single" w:color="000000" w:sz="12" w:space="6"/>
+          <w:bottom w:val="single" w:color="000000" w:sz="12" w:space="6"/>
+          <w:right w:val="single" w:color="000000" w:sz="12" w:space="6"/>
+        </w:pBdr>
+      </w:pPr>
+      <w:r>
+        <w:rPr>
+          <w:b/>
+          <w:bCs/>
+        </w:rPr>
+        <w:t xml:space="preserve">Con las manos. </w:t>
+      </w:r>
+      <w:r>
+        <w:t xml:space="preserve">Arma esta posición en tu tablero. Prueba con tus piezas las jugadas de las blancas. Después de cada una, toca las casillas de alrededor del rey negro: ¿puede escapar a alguna?</w:t>
+      </w:r>
+    </w:p>
+    <w:p>
+      <w:pPr>
+        <w:keepNext/>
+        <w:keepLines/>
       </w:pPr>
       <w:r>
         <w:rPr>
@@ -2686,7 +3043,7 @@
       <w:r>
         <w:drawing>
           <wp:inline distT="0" distB="0" distL="0" distR="0">
-            <wp:extent cx="3887986" cy="3887986"/>
+            <wp:extent cx="3239988" cy="3239988"/>
             <wp:effectExtent t="0" r="0" b="0" l="0"/>
             <wp:docPr id="1" name="Dibujo decorativo" descr="" title="">
               <a:extLst xmlns:a="http://schemas.openxmlformats.org/drawingml/2006/main">
@@ -2717,7 +3074,7 @@
                   <pic:spPr bwMode="auto">
                     <a:xfrm>
                       <a:off x="0" y="0"/>
-                      <a:ext cx="3887986" cy="3887986"/>
+                      <a:ext cx="3239988" cy="3239988"/>
                     </a:xfrm>
                     <a:prstGeom prst="rect">
                       <a:avLst/>
@@ -2756,6 +3113,28 @@
       <w:pPr>
         <w:keepNext/>
         <w:keepLines/>
+        <w:pBdr>
+          <w:top w:val="single" w:color="000000" w:sz="12" w:space="6"/>
+          <w:left w:val="single" w:color="000000" w:sz="12" w:space="6"/>
+          <w:bottom w:val="single" w:color="000000" w:sz="12" w:space="6"/>
+          <w:right w:val="single" w:color="000000" w:sz="12" w:space="6"/>
+        </w:pBdr>
+      </w:pPr>
+      <w:r>
+        <w:rPr>
+          <w:b/>
+          <w:bCs/>
+        </w:rPr>
+        <w:t xml:space="preserve">Con las manos. </w:t>
+      </w:r>
+      <w:r>
+        <w:t xml:space="preserve">Arma esta posición en tu tablero. Prueba con tus piezas las jugadas de las blancas. Después de cada una, toca las casillas de alrededor del rey negro: ¿puede escapar a alguna?</w:t>
+      </w:r>
+    </w:p>
+    <w:p>
+      <w:pPr>
+        <w:keepNext/>
+        <w:keepLines/>
       </w:pPr>
       <w:r>
         <w:rPr>
@@ -2803,7 +3182,7 @@
       <w:r>
         <w:drawing>
           <wp:inline distT="0" distB="0" distL="0" distR="0">
-            <wp:extent cx="3887986" cy="3887986"/>
+            <wp:extent cx="3239988" cy="3239988"/>
             <wp:effectExtent t="0" r="0" b="0" l="0"/>
             <wp:docPr id="1" name="Dibujo decorativo" descr="" title="">
               <a:extLst xmlns:a="http://schemas.openxmlformats.org/drawingml/2006/main">
@@ -2834,7 +3213,7 @@
                   <pic:spPr bwMode="auto">
                     <a:xfrm>
                       <a:off x="0" y="0"/>
-                      <a:ext cx="3887986" cy="3887986"/>
+                      <a:ext cx="3239988" cy="3239988"/>
                     </a:xfrm>
                     <a:prstGeom prst="rect">
                       <a:avLst/>
@@ -2867,6 +3246,28 @@
       </w:r>
       <w:r>
         <w:t xml:space="preserve">Piezas blancas: rey en a2; torres en b8, c6. Piezas negras: rey en h7.</w:t>
+      </w:r>
+    </w:p>
+    <w:p>
+      <w:pPr>
+        <w:keepNext/>
+        <w:keepLines/>
+        <w:pBdr>
+          <w:top w:val="single" w:color="000000" w:sz="12" w:space="6"/>
+          <w:left w:val="single" w:color="000000" w:sz="12" w:space="6"/>
+          <w:bottom w:val="single" w:color="000000" w:sz="12" w:space="6"/>
+          <w:right w:val="single" w:color="000000" w:sz="12" w:space="6"/>
+        </w:pBdr>
+      </w:pPr>
+      <w:r>
+        <w:rPr>
+          <w:b/>
+          <w:bCs/>
+        </w:rPr>
+        <w:t xml:space="preserve">Con las manos. </w:t>
+      </w:r>
+      <w:r>
+        <w:t xml:space="preserve">Arma esta posición en tu tablero. Prueba con tus piezas: haz la primera jugada, contesta por las negras y busca el mate.</w:t>
       </w:r>
     </w:p>
     <w:p>
@@ -3101,7 +3502,7 @@
       <w:r>
         <w:drawing>
           <wp:inline distT="0" distB="0" distL="0" distR="0">
-            <wp:extent cx="5399931" cy="5399931"/>
+            <wp:extent cx="4319885" cy="4319885"/>
             <wp:effectExtent t="0" r="0" b="0" l="0"/>
             <wp:docPr id="1" name="Dibujo decorativo" descr="" title="">
               <a:extLst xmlns:a="http://schemas.openxmlformats.org/drawingml/2006/main">
@@ -3132,7 +3533,7 @@
                   <pic:spPr bwMode="auto">
                     <a:xfrm>
                       <a:off x="0" y="0"/>
-                      <a:ext cx="5399931" cy="5399931"/>
+                      <a:ext cx="4319885" cy="4319885"/>
                     </a:xfrm>
                     <a:prstGeom prst="rect">
                       <a:avLst/>
@@ -3160,6 +3561,7 @@
     </w:p>
     <w:p>
       <w:pPr>
+        <w:keepNext/>
         <w:keepLines/>
         <w:pBdr>
           <w:top w:val="single" w:color="000000" w:sz="12" w:space="6"/>
@@ -3176,7 +3578,28 @@
         <w:t xml:space="preserve">La posición. </w:t>
       </w:r>
       <w:r>
-        <w:t xml:space="preserve">Piezas blancas: rey en f6; dama en c1. Piezas negras: rey en f8. La flecha va de c1 a c8.</w:t>
+        <w:t xml:space="preserve">Piezas blancas: rey en f6; dama en c1. Piezas negras: rey en f8.</w:t>
+      </w:r>
+    </w:p>
+    <w:p>
+      <w:pPr>
+        <w:keepLines/>
+        <w:pBdr>
+          <w:top w:val="single" w:color="000000" w:sz="12" w:space="6"/>
+          <w:left w:val="single" w:color="000000" w:sz="12" w:space="6"/>
+          <w:bottom w:val="single" w:color="000000" w:sz="12" w:space="6"/>
+          <w:right w:val="single" w:color="000000" w:sz="12" w:space="6"/>
+        </w:pBdr>
+      </w:pPr>
+      <w:r>
+        <w:rPr>
+          <w:b/>
+          <w:bCs/>
+        </w:rPr>
+        <w:t xml:space="preserve">Con las manos. </w:t>
+      </w:r>
+      <w:r>
+        <w:t xml:space="preserve">Arma esta posición en tu tablero. Con el dedo, sigue el camino de c1 a c8.</w:t>
       </w:r>
     </w:p>
     <w:p>
@@ -3260,7 +3683,7 @@
       <w:r>
         <w:drawing>
           <wp:inline distT="0" distB="0" distL="0" distR="0">
-            <wp:extent cx="3887986" cy="3887986"/>
+            <wp:extent cx="3239988" cy="3239988"/>
             <wp:effectExtent t="0" r="0" b="0" l="0"/>
             <wp:docPr id="1" name="Dibujo decorativo" descr="" title="">
               <a:extLst xmlns:a="http://schemas.openxmlformats.org/drawingml/2006/main">
@@ -3291,7 +3714,7 @@
                   <pic:spPr bwMode="auto">
                     <a:xfrm>
                       <a:off x="0" y="0"/>
-                      <a:ext cx="3887986" cy="3887986"/>
+                      <a:ext cx="3239988" cy="3239988"/>
                     </a:xfrm>
                     <a:prstGeom prst="rect">
                       <a:avLst/>
@@ -3330,6 +3753,28 @@
       <w:pPr>
         <w:keepNext/>
         <w:keepLines/>
+        <w:pBdr>
+          <w:top w:val="single" w:color="000000" w:sz="12" w:space="6"/>
+          <w:left w:val="single" w:color="000000" w:sz="12" w:space="6"/>
+          <w:bottom w:val="single" w:color="000000" w:sz="12" w:space="6"/>
+          <w:right w:val="single" w:color="000000" w:sz="12" w:space="6"/>
+        </w:pBdr>
+      </w:pPr>
+      <w:r>
+        <w:rPr>
+          <w:b/>
+          <w:bCs/>
+        </w:rPr>
+        <w:t xml:space="preserve">Con las manos. </w:t>
+      </w:r>
+      <w:r>
+        <w:t xml:space="preserve">Arma esta posición en tu tablero. Prueba con tus piezas las jugadas de las blancas. Después de cada una, toca las casillas de alrededor del rey negro: ¿puede escapar a alguna?</w:t>
+      </w:r>
+    </w:p>
+    <w:p>
+      <w:pPr>
+        <w:keepNext/>
+        <w:keepLines/>
       </w:pPr>
       <w:r>
         <w:rPr>
@@ -3377,7 +3822,7 @@
       <w:r>
         <w:drawing>
           <wp:inline distT="0" distB="0" distL="0" distR="0">
-            <wp:extent cx="3887986" cy="3887986"/>
+            <wp:extent cx="3239988" cy="3239988"/>
             <wp:effectExtent t="0" r="0" b="0" l="0"/>
             <wp:docPr id="1" name="Dibujo decorativo" descr="" title="">
               <a:extLst xmlns:a="http://schemas.openxmlformats.org/drawingml/2006/main">
@@ -3408,7 +3853,7 @@
                   <pic:spPr bwMode="auto">
                     <a:xfrm>
                       <a:off x="0" y="0"/>
-                      <a:ext cx="3887986" cy="3887986"/>
+                      <a:ext cx="3239988" cy="3239988"/>
                     </a:xfrm>
                     <a:prstGeom prst="rect">
                       <a:avLst/>
@@ -3447,6 +3892,28 @@
       <w:pPr>
         <w:keepNext/>
         <w:keepLines/>
+        <w:pBdr>
+          <w:top w:val="single" w:color="000000" w:sz="12" w:space="6"/>
+          <w:left w:val="single" w:color="000000" w:sz="12" w:space="6"/>
+          <w:bottom w:val="single" w:color="000000" w:sz="12" w:space="6"/>
+          <w:right w:val="single" w:color="000000" w:sz="12" w:space="6"/>
+        </w:pBdr>
+      </w:pPr>
+      <w:r>
+        <w:rPr>
+          <w:b/>
+          <w:bCs/>
+        </w:rPr>
+        <w:t xml:space="preserve">Con las manos. </w:t>
+      </w:r>
+      <w:r>
+        <w:t xml:space="preserve">Arma esta posición en tu tablero. Prueba con tus piezas las jugadas de las blancas. Después de cada una, toca las casillas de alrededor del rey negro: ¿puede escapar a alguna?</w:t>
+      </w:r>
+    </w:p>
+    <w:p>
+      <w:pPr>
+        <w:keepNext/>
+        <w:keepLines/>
       </w:pPr>
       <w:r>
         <w:rPr>
@@ -3494,7 +3961,7 @@
       <w:r>
         <w:drawing>
           <wp:inline distT="0" distB="0" distL="0" distR="0">
-            <wp:extent cx="3887986" cy="3887986"/>
+            <wp:extent cx="3239988" cy="3239988"/>
             <wp:effectExtent t="0" r="0" b="0" l="0"/>
             <wp:docPr id="1" name="Dibujo decorativo" descr="" title="">
               <a:extLst xmlns:a="http://schemas.openxmlformats.org/drawingml/2006/main">
@@ -3525,7 +3992,7 @@
                   <pic:spPr bwMode="auto">
                     <a:xfrm>
                       <a:off x="0" y="0"/>
-                      <a:ext cx="3887986" cy="3887986"/>
+                      <a:ext cx="3239988" cy="3239988"/>
                     </a:xfrm>
                     <a:prstGeom prst="rect">
                       <a:avLst/>
@@ -3558,6 +4025,28 @@
       </w:r>
       <w:r>
         <w:t xml:space="preserve">Piezas blancas: rey en f3; dama en c6. Piezas negras: rey en f1.</w:t>
+      </w:r>
+    </w:p>
+    <w:p>
+      <w:pPr>
+        <w:keepNext/>
+        <w:keepLines/>
+        <w:pBdr>
+          <w:top w:val="single" w:color="000000" w:sz="12" w:space="6"/>
+          <w:left w:val="single" w:color="000000" w:sz="12" w:space="6"/>
+          <w:bottom w:val="single" w:color="000000" w:sz="12" w:space="6"/>
+          <w:right w:val="single" w:color="000000" w:sz="12" w:space="6"/>
+        </w:pBdr>
+      </w:pPr>
+      <w:r>
+        <w:rPr>
+          <w:b/>
+          <w:bCs/>
+        </w:rPr>
+        <w:t xml:space="preserve">Con las manos. </w:t>
+      </w:r>
+      <w:r>
+        <w:t xml:space="preserve">Arma esta posición en tu tablero. Prueba con tus piezas las jugadas de las blancas. Después de cada una, toca las casillas de alrededor del rey negro: ¿puede escapar a alguna?</w:t>
       </w:r>
     </w:p>
     <w:p>
@@ -3792,7 +4281,7 @@
       <w:r>
         <w:drawing>
           <wp:inline distT="0" distB="0" distL="0" distR="0">
-            <wp:extent cx="5399931" cy="5399931"/>
+            <wp:extent cx="4319885" cy="4319885"/>
             <wp:effectExtent t="0" r="0" b="0" l="0"/>
             <wp:docPr id="1" name="Dibujo decorativo" descr="" title="">
               <a:extLst xmlns:a="http://schemas.openxmlformats.org/drawingml/2006/main">
@@ -3823,7 +4312,7 @@
                   <pic:spPr bwMode="auto">
                     <a:xfrm>
                       <a:off x="0" y="0"/>
-                      <a:ext cx="5399931" cy="5399931"/>
+                      <a:ext cx="4319885" cy="4319885"/>
                     </a:xfrm>
                     <a:prstGeom prst="rect">
                       <a:avLst/>
@@ -3851,6 +4340,7 @@
     </w:p>
     <w:p>
       <w:pPr>
+        <w:keepNext/>
         <w:keepLines/>
         <w:pBdr>
           <w:top w:val="single" w:color="000000" w:sz="12" w:space="6"/>
@@ -3872,6 +4362,27 @@
     </w:p>
     <w:p>
       <w:pPr>
+        <w:keepLines/>
+        <w:pBdr>
+          <w:top w:val="single" w:color="000000" w:sz="12" w:space="6"/>
+          <w:left w:val="single" w:color="000000" w:sz="12" w:space="6"/>
+          <w:bottom w:val="single" w:color="000000" w:sz="12" w:space="6"/>
+          <w:right w:val="single" w:color="000000" w:sz="12" w:space="6"/>
+        </w:pBdr>
+      </w:pPr>
+      <w:r>
+        <w:rPr>
+          <w:b/>
+          <w:bCs/>
+        </w:rPr>
+        <w:t xml:space="preserve">Con las manos. </w:t>
+      </w:r>
+      <w:r>
+        <w:t xml:space="preserve">Arma esta posición en tu tablero.</w:t>
+      </w:r>
+    </w:p>
+    <w:p>
+      <w:pPr>
         <w:pStyle w:val="Heading3"/>
         <w:keepNext/>
         <w:keepLines/>
@@ -3951,7 +4462,7 @@
       <w:r>
         <w:drawing>
           <wp:inline distT="0" distB="0" distL="0" distR="0">
-            <wp:extent cx="3887986" cy="3887986"/>
+            <wp:extent cx="3239988" cy="3239988"/>
             <wp:effectExtent t="0" r="0" b="0" l="0"/>
             <wp:docPr id="1" name="Dibujo decorativo" descr="" title="">
               <a:extLst xmlns:a="http://schemas.openxmlformats.org/drawingml/2006/main">
@@ -3982,7 +4493,7 @@
                   <pic:spPr bwMode="auto">
                     <a:xfrm>
                       <a:off x="0" y="0"/>
-                      <a:ext cx="3887986" cy="3887986"/>
+                      <a:ext cx="3239988" cy="3239988"/>
                     </a:xfrm>
                     <a:prstGeom prst="rect">
                       <a:avLst/>
@@ -4021,13 +4532,35 @@
       <w:pPr>
         <w:keepNext/>
         <w:keepLines/>
-      </w:pPr>
-      <w:r>
-        <w:rPr>
-          <w:b/>
-          <w:bCs/>
-        </w:rPr>
-        <w:t xml:space="preserve">Le toca mover al rey negro. ¿Qué pasó? ¿Jaque mate, ahogado o ninguno?</w:t>
+        <w:pBdr>
+          <w:top w:val="single" w:color="000000" w:sz="12" w:space="6"/>
+          <w:left w:val="single" w:color="000000" w:sz="12" w:space="6"/>
+          <w:bottom w:val="single" w:color="000000" w:sz="12" w:space="6"/>
+          <w:right w:val="single" w:color="000000" w:sz="12" w:space="6"/>
+        </w:pBdr>
+      </w:pPr>
+      <w:r>
+        <w:rPr>
+          <w:b/>
+          <w:bCs/>
+        </w:rPr>
+        <w:t xml:space="preserve">Con las manos. </w:t>
+      </w:r>
+      <w:r>
+        <w:t xml:space="preserve">Arma esta posición en tu tablero. Toca, una por una, las casillas de alrededor del rey negro. Para cada una, busca si alguna pieza blanca llega hasta ahí.</w:t>
+      </w:r>
+    </w:p>
+    <w:p>
+      <w:pPr>
+        <w:keepNext/>
+        <w:keepLines/>
+      </w:pPr>
+      <w:r>
+        <w:rPr>
+          <w:b/>
+          <w:bCs/>
+        </w:rPr>
+        <w:t xml:space="preserve">Le toca mover al rey negro. ¿Qué pasó: jaque mate, ahogado o ninguno?</w:t>
       </w:r>
     </w:p>
     <w:p>
@@ -4068,7 +4601,7 @@
       <w:r>
         <w:drawing>
           <wp:inline distT="0" distB="0" distL="0" distR="0">
-            <wp:extent cx="3887986" cy="3887986"/>
+            <wp:extent cx="3239988" cy="3239988"/>
             <wp:effectExtent t="0" r="0" b="0" l="0"/>
             <wp:docPr id="1" name="Dibujo decorativo" descr="" title="">
               <a:extLst xmlns:a="http://schemas.openxmlformats.org/drawingml/2006/main">
@@ -4099,7 +4632,7 @@
                   <pic:spPr bwMode="auto">
                     <a:xfrm>
                       <a:off x="0" y="0"/>
-                      <a:ext cx="3887986" cy="3887986"/>
+                      <a:ext cx="3239988" cy="3239988"/>
                     </a:xfrm>
                     <a:prstGeom prst="rect">
                       <a:avLst/>
@@ -4138,13 +4671,35 @@
       <w:pPr>
         <w:keepNext/>
         <w:keepLines/>
-      </w:pPr>
-      <w:r>
-        <w:rPr>
-          <w:b/>
-          <w:bCs/>
-        </w:rPr>
-        <w:t xml:space="preserve">Le toca mover al rey negro. ¿Qué pasó? ¿Jaque mate, ahogado o ninguno?</w:t>
+        <w:pBdr>
+          <w:top w:val="single" w:color="000000" w:sz="12" w:space="6"/>
+          <w:left w:val="single" w:color="000000" w:sz="12" w:space="6"/>
+          <w:bottom w:val="single" w:color="000000" w:sz="12" w:space="6"/>
+          <w:right w:val="single" w:color="000000" w:sz="12" w:space="6"/>
+        </w:pBdr>
+      </w:pPr>
+      <w:r>
+        <w:rPr>
+          <w:b/>
+          <w:bCs/>
+        </w:rPr>
+        <w:t xml:space="preserve">Con las manos. </w:t>
+      </w:r>
+      <w:r>
+        <w:t xml:space="preserve">Arma esta posición en tu tablero. Toca, una por una, las casillas de alrededor del rey negro. Para cada una, busca si alguna pieza blanca llega hasta ahí.</w:t>
+      </w:r>
+    </w:p>
+    <w:p>
+      <w:pPr>
+        <w:keepNext/>
+        <w:keepLines/>
+      </w:pPr>
+      <w:r>
+        <w:rPr>
+          <w:b/>
+          <w:bCs/>
+        </w:rPr>
+        <w:t xml:space="preserve">Le toca mover al rey negro. ¿Qué pasó: jaque mate, ahogado o ninguno?</w:t>
       </w:r>
     </w:p>
     <w:p>
@@ -4185,7 +4740,7 @@
       <w:r>
         <w:drawing>
           <wp:inline distT="0" distB="0" distL="0" distR="0">
-            <wp:extent cx="3887986" cy="3887986"/>
+            <wp:extent cx="3239988" cy="3239988"/>
             <wp:effectExtent t="0" r="0" b="0" l="0"/>
             <wp:docPr id="1" name="Dibujo decorativo" descr="" title="">
               <a:extLst xmlns:a="http://schemas.openxmlformats.org/drawingml/2006/main">
@@ -4216,7 +4771,7 @@
                   <pic:spPr bwMode="auto">
                     <a:xfrm>
                       <a:off x="0" y="0"/>
-                      <a:ext cx="3887986" cy="3887986"/>
+                      <a:ext cx="3239988" cy="3239988"/>
                     </a:xfrm>
                     <a:prstGeom prst="rect">
                       <a:avLst/>
@@ -4255,6 +4810,28 @@
       <w:pPr>
         <w:keepNext/>
         <w:keepLines/>
+        <w:pBdr>
+          <w:top w:val="single" w:color="000000" w:sz="12" w:space="6"/>
+          <w:left w:val="single" w:color="000000" w:sz="12" w:space="6"/>
+          <w:bottom w:val="single" w:color="000000" w:sz="12" w:space="6"/>
+          <w:right w:val="single" w:color="000000" w:sz="12" w:space="6"/>
+        </w:pBdr>
+      </w:pPr>
+      <w:r>
+        <w:rPr>
+          <w:b/>
+          <w:bCs/>
+        </w:rPr>
+        <w:t xml:space="preserve">Con las manos. </w:t>
+      </w:r>
+      <w:r>
+        <w:t xml:space="preserve">Arma esta posición en tu tablero. Prueba las dos jugadas con tus piezas, una por vez, y toca las casillas de alrededor del rey negro.</w:t>
+      </w:r>
+    </w:p>
+    <w:p>
+      <w:pPr>
+        <w:keepNext/>
+        <w:keepLines/>
       </w:pPr>
       <w:r>
         <w:rPr>
@@ -4302,7 +4879,7 @@
       <w:r>
         <w:drawing>
           <wp:inline distT="0" distB="0" distL="0" distR="0">
-            <wp:extent cx="3887986" cy="3887986"/>
+            <wp:extent cx="3239988" cy="3239988"/>
             <wp:effectExtent t="0" r="0" b="0" l="0"/>
             <wp:docPr id="1" name="Dibujo decorativo" descr="" title="">
               <a:extLst xmlns:a="http://schemas.openxmlformats.org/drawingml/2006/main">
@@ -4333,7 +4910,7 @@
                   <pic:spPr bwMode="auto">
                     <a:xfrm>
                       <a:off x="0" y="0"/>
-                      <a:ext cx="3887986" cy="3887986"/>
+                      <a:ext cx="3239988" cy="3239988"/>
                     </a:xfrm>
                     <a:prstGeom prst="rect">
                       <a:avLst/>
@@ -4366,6 +4943,28 @@
       </w:r>
       <w:r>
         <w:t xml:space="preserve">Piezas blancas: rey en b6; dama en c1. Piezas negras: rey en a8.</w:t>
+      </w:r>
+    </w:p>
+    <w:p>
+      <w:pPr>
+        <w:keepNext/>
+        <w:keepLines/>
+        <w:pBdr>
+          <w:top w:val="single" w:color="000000" w:sz="12" w:space="6"/>
+          <w:left w:val="single" w:color="000000" w:sz="12" w:space="6"/>
+          <w:bottom w:val="single" w:color="000000" w:sz="12" w:space="6"/>
+          <w:right w:val="single" w:color="000000" w:sz="12" w:space="6"/>
+        </w:pBdr>
+      </w:pPr>
+      <w:r>
+        <w:rPr>
+          <w:b/>
+          <w:bCs/>
+        </w:rPr>
+        <w:t xml:space="preserve">Con las manos. </w:t>
+      </w:r>
+      <w:r>
+        <w:t xml:space="preserve">Arma esta posición en tu tablero. Prueba las dos jugadas con tus piezas, una por vez, y toca las casillas de alrededor del rey negro.</w:t>
       </w:r>
     </w:p>
     <w:p>
@@ -4588,7 +5187,7 @@
       <w:r>
         <w:drawing>
           <wp:inline distT="0" distB="0" distL="0" distR="0">
-            <wp:extent cx="5399931" cy="5399931"/>
+            <wp:extent cx="4319885" cy="4319885"/>
             <wp:effectExtent t="0" r="0" b="0" l="0"/>
             <wp:docPr id="1" name="Dibujo decorativo" descr="" title="">
               <a:extLst xmlns:a="http://schemas.openxmlformats.org/drawingml/2006/main">
@@ -4619,7 +5218,7 @@
                   <pic:spPr bwMode="auto">
                     <a:xfrm>
                       <a:off x="0" y="0"/>
-                      <a:ext cx="5399931" cy="5399931"/>
+                      <a:ext cx="4319885" cy="4319885"/>
                     </a:xfrm>
                     <a:prstGeom prst="rect">
                       <a:avLst/>
@@ -4647,6 +5246,7 @@
     </w:p>
     <w:p>
       <w:pPr>
+        <w:keepNext/>
         <w:keepLines/>
         <w:pBdr>
           <w:top w:val="single" w:color="000000" w:sz="12" w:space="6"/>
@@ -4663,7 +5263,28 @@
         <w:t xml:space="preserve">La posición. </w:t>
       </w:r>
       <w:r>
-        <w:t xml:space="preserve">Piezas blancas: rey en b6; dama en b7. Piezas negras: rey en a8. La flecha va de b6 a b7.</w:t>
+        <w:t xml:space="preserve">Piezas blancas: rey en b6; dama en b7. Piezas negras: rey en a8.</w:t>
+      </w:r>
+    </w:p>
+    <w:p>
+      <w:pPr>
+        <w:keepLines/>
+        <w:pBdr>
+          <w:top w:val="single" w:color="000000" w:sz="12" w:space="6"/>
+          <w:left w:val="single" w:color="000000" w:sz="12" w:space="6"/>
+          <w:bottom w:val="single" w:color="000000" w:sz="12" w:space="6"/>
+          <w:right w:val="single" w:color="000000" w:sz="12" w:space="6"/>
+        </w:pBdr>
+      </w:pPr>
+      <w:r>
+        <w:rPr>
+          <w:b/>
+          <w:bCs/>
+        </w:rPr>
+        <w:t xml:space="preserve">Con las manos. </w:t>
+      </w:r>
+      <w:r>
+        <w:t xml:space="preserve">Arma esta posición en tu tablero. Con el dedo, sigue el camino de b6 a b7.</w:t>
       </w:r>
     </w:p>
     <w:p>
@@ -4747,7 +5368,7 @@
       <w:r>
         <w:drawing>
           <wp:inline distT="0" distB="0" distL="0" distR="0">
-            <wp:extent cx="3887986" cy="3887986"/>
+            <wp:extent cx="3239988" cy="3239988"/>
             <wp:effectExtent t="0" r="0" b="0" l="0"/>
             <wp:docPr id="1" name="Dibujo decorativo" descr="" title="">
               <a:extLst xmlns:a="http://schemas.openxmlformats.org/drawingml/2006/main">
@@ -4778,7 +5399,7 @@
                   <pic:spPr bwMode="auto">
                     <a:xfrm>
                       <a:off x="0" y="0"/>
-                      <a:ext cx="3887986" cy="3887986"/>
+                      <a:ext cx="3239988" cy="3239988"/>
                     </a:xfrm>
                     <a:prstGeom prst="rect">
                       <a:avLst/>
@@ -4817,6 +5438,28 @@
       <w:pPr>
         <w:keepNext/>
         <w:keepLines/>
+        <w:pBdr>
+          <w:top w:val="single" w:color="000000" w:sz="12" w:space="6"/>
+          <w:left w:val="single" w:color="000000" w:sz="12" w:space="6"/>
+          <w:bottom w:val="single" w:color="000000" w:sz="12" w:space="6"/>
+          <w:right w:val="single" w:color="000000" w:sz="12" w:space="6"/>
+        </w:pBdr>
+      </w:pPr>
+      <w:r>
+        <w:rPr>
+          <w:b/>
+          <w:bCs/>
+        </w:rPr>
+        <w:t xml:space="preserve">Con las manos. </w:t>
+      </w:r>
+      <w:r>
+        <w:t xml:space="preserve">Arma esta posición en tu tablero. Prueba con tus piezas las jugadas de las blancas. Después de cada una, toca las casillas de alrededor del rey negro: ¿puede escapar a alguna?</w:t>
+      </w:r>
+    </w:p>
+    <w:p>
+      <w:pPr>
+        <w:keepNext/>
+        <w:keepLines/>
       </w:pPr>
       <w:r>
         <w:rPr>
@@ -4864,7 +5507,7 @@
       <w:r>
         <w:drawing>
           <wp:inline distT="0" distB="0" distL="0" distR="0">
-            <wp:extent cx="3887986" cy="3887986"/>
+            <wp:extent cx="3239988" cy="3239988"/>
             <wp:effectExtent t="0" r="0" b="0" l="0"/>
             <wp:docPr id="1" name="Dibujo decorativo" descr="" title="">
               <a:extLst xmlns:a="http://schemas.openxmlformats.org/drawingml/2006/main">
@@ -4895,7 +5538,7 @@
                   <pic:spPr bwMode="auto">
                     <a:xfrm>
                       <a:off x="0" y="0"/>
-                      <a:ext cx="3887986" cy="3887986"/>
+                      <a:ext cx="3239988" cy="3239988"/>
                     </a:xfrm>
                     <a:prstGeom prst="rect">
                       <a:avLst/>
@@ -4934,6 +5577,28 @@
       <w:pPr>
         <w:keepNext/>
         <w:keepLines/>
+        <w:pBdr>
+          <w:top w:val="single" w:color="000000" w:sz="12" w:space="6"/>
+          <w:left w:val="single" w:color="000000" w:sz="12" w:space="6"/>
+          <w:bottom w:val="single" w:color="000000" w:sz="12" w:space="6"/>
+          <w:right w:val="single" w:color="000000" w:sz="12" w:space="6"/>
+        </w:pBdr>
+      </w:pPr>
+      <w:r>
+        <w:rPr>
+          <w:b/>
+          <w:bCs/>
+        </w:rPr>
+        <w:t xml:space="preserve">Con las manos. </w:t>
+      </w:r>
+      <w:r>
+        <w:t xml:space="preserve">Arma esta posición en tu tablero. Prueba con tus piezas las jugadas de las blancas. Después de cada una, toca las casillas de alrededor del rey negro: ¿puede escapar a alguna?</w:t>
+      </w:r>
+    </w:p>
+    <w:p>
+      <w:pPr>
+        <w:keepNext/>
+        <w:keepLines/>
       </w:pPr>
       <w:r>
         <w:rPr>
@@ -4981,7 +5646,7 @@
       <w:r>
         <w:drawing>
           <wp:inline distT="0" distB="0" distL="0" distR="0">
-            <wp:extent cx="3887986" cy="3887986"/>
+            <wp:extent cx="3239988" cy="3239988"/>
             <wp:effectExtent t="0" r="0" b="0" l="0"/>
             <wp:docPr id="1" name="Dibujo decorativo" descr="" title="">
               <a:extLst xmlns:a="http://schemas.openxmlformats.org/drawingml/2006/main">
@@ -5012,7 +5677,7 @@
                   <pic:spPr bwMode="auto">
                     <a:xfrm>
                       <a:off x="0" y="0"/>
-                      <a:ext cx="3887986" cy="3887986"/>
+                      <a:ext cx="3239988" cy="3239988"/>
                     </a:xfrm>
                     <a:prstGeom prst="rect">
                       <a:avLst/>
@@ -5045,6 +5710,28 @@
       </w:r>
       <w:r>
         <w:t xml:space="preserve">Piezas blancas: rey en f6; dama en b4. Piezas negras: rey en e8.</w:t>
+      </w:r>
+    </w:p>
+    <w:p>
+      <w:pPr>
+        <w:keepNext/>
+        <w:keepLines/>
+        <w:pBdr>
+          <w:top w:val="single" w:color="000000" w:sz="12" w:space="6"/>
+          <w:left w:val="single" w:color="000000" w:sz="12" w:space="6"/>
+          <w:bottom w:val="single" w:color="000000" w:sz="12" w:space="6"/>
+          <w:right w:val="single" w:color="000000" w:sz="12" w:space="6"/>
+        </w:pBdr>
+      </w:pPr>
+      <w:r>
+        <w:rPr>
+          <w:b/>
+          <w:bCs/>
+        </w:rPr>
+        <w:t xml:space="preserve">Con las manos. </w:t>
+      </w:r>
+      <w:r>
+        <w:t xml:space="preserve">Arma esta posición en tu tablero. Prueba con tus piezas las jugadas de las blancas. Después de cada una, toca las casillas de alrededor del rey negro: ¿puede escapar a alguna?</w:t>
       </w:r>
     </w:p>
     <w:p>
@@ -5267,7 +5954,7 @@
       <w:r>
         <w:drawing>
           <wp:inline distT="0" distB="0" distL="0" distR="0">
-            <wp:extent cx="5399931" cy="5399931"/>
+            <wp:extent cx="4319885" cy="4319885"/>
             <wp:effectExtent t="0" r="0" b="0" l="0"/>
             <wp:docPr id="1" name="Dibujo decorativo" descr="" title="">
               <a:extLst xmlns:a="http://schemas.openxmlformats.org/drawingml/2006/main">
@@ -5298,7 +5985,7 @@
                   <pic:spPr bwMode="auto">
                     <a:xfrm>
                       <a:off x="0" y="0"/>
-                      <a:ext cx="5399931" cy="5399931"/>
+                      <a:ext cx="4319885" cy="4319885"/>
                     </a:xfrm>
                     <a:prstGeom prst="rect">
                       <a:avLst/>
@@ -5326,6 +6013,7 @@
     </w:p>
     <w:p>
       <w:pPr>
+        <w:keepNext/>
         <w:keepLines/>
         <w:pBdr>
           <w:top w:val="single" w:color="000000" w:sz="12" w:space="6"/>
@@ -5342,7 +6030,28 @@
         <w:t xml:space="preserve">La posición. </w:t>
       </w:r>
       <w:r>
-        <w:t xml:space="preserve">Piezas blancas: rey en b6; torre en h1. Piezas negras: rey en b8. La flecha va de h1 a h8.</w:t>
+        <w:t xml:space="preserve">Piezas blancas: rey en b6; torre en h1. Piezas negras: rey en b8.</w:t>
+      </w:r>
+    </w:p>
+    <w:p>
+      <w:pPr>
+        <w:keepLines/>
+        <w:pBdr>
+          <w:top w:val="single" w:color="000000" w:sz="12" w:space="6"/>
+          <w:left w:val="single" w:color="000000" w:sz="12" w:space="6"/>
+          <w:bottom w:val="single" w:color="000000" w:sz="12" w:space="6"/>
+          <w:right w:val="single" w:color="000000" w:sz="12" w:space="6"/>
+        </w:pBdr>
+      </w:pPr>
+      <w:r>
+        <w:rPr>
+          <w:b/>
+          <w:bCs/>
+        </w:rPr>
+        <w:t xml:space="preserve">Con las manos. </w:t>
+      </w:r>
+      <w:r>
+        <w:t xml:space="preserve">Arma esta posición en tu tablero. Con el dedo, sigue el camino de h1 a h8.</w:t>
       </w:r>
     </w:p>
     <w:p>
@@ -5426,7 +6135,7 @@
       <w:r>
         <w:drawing>
           <wp:inline distT="0" distB="0" distL="0" distR="0">
-            <wp:extent cx="3887986" cy="3887986"/>
+            <wp:extent cx="3239988" cy="3239988"/>
             <wp:effectExtent t="0" r="0" b="0" l="0"/>
             <wp:docPr id="1" name="Dibujo decorativo" descr="" title="">
               <a:extLst xmlns:a="http://schemas.openxmlformats.org/drawingml/2006/main">
@@ -5457,7 +6166,7 @@
                   <pic:spPr bwMode="auto">
                     <a:xfrm>
                       <a:off x="0" y="0"/>
-                      <a:ext cx="3887986" cy="3887986"/>
+                      <a:ext cx="3239988" cy="3239988"/>
                     </a:xfrm>
                     <a:prstGeom prst="rect">
                       <a:avLst/>
@@ -5496,6 +6205,28 @@
       <w:pPr>
         <w:keepNext/>
         <w:keepLines/>
+        <w:pBdr>
+          <w:top w:val="single" w:color="000000" w:sz="12" w:space="6"/>
+          <w:left w:val="single" w:color="000000" w:sz="12" w:space="6"/>
+          <w:bottom w:val="single" w:color="000000" w:sz="12" w:space="6"/>
+          <w:right w:val="single" w:color="000000" w:sz="12" w:space="6"/>
+        </w:pBdr>
+      </w:pPr>
+      <w:r>
+        <w:rPr>
+          <w:b/>
+          <w:bCs/>
+        </w:rPr>
+        <w:t xml:space="preserve">Con las manos. </w:t>
+      </w:r>
+      <w:r>
+        <w:t xml:space="preserve">Arma esta posición en tu tablero. Prueba con tus piezas las jugadas de las blancas. Después de cada una, toca las casillas de alrededor del rey negro: ¿puede escapar a alguna?</w:t>
+      </w:r>
+    </w:p>
+    <w:p>
+      <w:pPr>
+        <w:keepNext/>
+        <w:keepLines/>
       </w:pPr>
       <w:r>
         <w:rPr>
@@ -5543,7 +6274,7 @@
       <w:r>
         <w:drawing>
           <wp:inline distT="0" distB="0" distL="0" distR="0">
-            <wp:extent cx="3887986" cy="3887986"/>
+            <wp:extent cx="3239988" cy="3239988"/>
             <wp:effectExtent t="0" r="0" b="0" l="0"/>
             <wp:docPr id="1" name="Dibujo decorativo" descr="" title="">
               <a:extLst xmlns:a="http://schemas.openxmlformats.org/drawingml/2006/main">
@@ -5574,7 +6305,7 @@
                   <pic:spPr bwMode="auto">
                     <a:xfrm>
                       <a:off x="0" y="0"/>
-                      <a:ext cx="3887986" cy="3887986"/>
+                      <a:ext cx="3239988" cy="3239988"/>
                     </a:xfrm>
                     <a:prstGeom prst="rect">
                       <a:avLst/>
@@ -5613,6 +6344,28 @@
       <w:pPr>
         <w:keepNext/>
         <w:keepLines/>
+        <w:pBdr>
+          <w:top w:val="single" w:color="000000" w:sz="12" w:space="6"/>
+          <w:left w:val="single" w:color="000000" w:sz="12" w:space="6"/>
+          <w:bottom w:val="single" w:color="000000" w:sz="12" w:space="6"/>
+          <w:right w:val="single" w:color="000000" w:sz="12" w:space="6"/>
+        </w:pBdr>
+      </w:pPr>
+      <w:r>
+        <w:rPr>
+          <w:b/>
+          <w:bCs/>
+        </w:rPr>
+        <w:t xml:space="preserve">Con las manos. </w:t>
+      </w:r>
+      <w:r>
+        <w:t xml:space="preserve">Arma esta posición en tu tablero. Prueba con tus piezas las jugadas de las blancas. Después de cada una, toca las casillas de alrededor del rey negro: ¿puede escapar a alguna?</w:t>
+      </w:r>
+    </w:p>
+    <w:p>
+      <w:pPr>
+        <w:keepNext/>
+        <w:keepLines/>
       </w:pPr>
       <w:r>
         <w:rPr>
@@ -5660,7 +6413,7 @@
       <w:r>
         <w:drawing>
           <wp:inline distT="0" distB="0" distL="0" distR="0">
-            <wp:extent cx="3887986" cy="3887986"/>
+            <wp:extent cx="3239988" cy="3239988"/>
             <wp:effectExtent t="0" r="0" b="0" l="0"/>
             <wp:docPr id="1" name="Dibujo decorativo" descr="" title="">
               <a:extLst xmlns:a="http://schemas.openxmlformats.org/drawingml/2006/main">
@@ -5691,7 +6444,7 @@
                   <pic:spPr bwMode="auto">
                     <a:xfrm>
                       <a:off x="0" y="0"/>
-                      <a:ext cx="3887986" cy="3887986"/>
+                      <a:ext cx="3239988" cy="3239988"/>
                     </a:xfrm>
                     <a:prstGeom prst="rect">
                       <a:avLst/>
@@ -5730,6 +6483,28 @@
       <w:pPr>
         <w:keepNext/>
         <w:keepLines/>
+        <w:pBdr>
+          <w:top w:val="single" w:color="000000" w:sz="12" w:space="6"/>
+          <w:left w:val="single" w:color="000000" w:sz="12" w:space="6"/>
+          <w:bottom w:val="single" w:color="000000" w:sz="12" w:space="6"/>
+          <w:right w:val="single" w:color="000000" w:sz="12" w:space="6"/>
+        </w:pBdr>
+      </w:pPr>
+      <w:r>
+        <w:rPr>
+          <w:b/>
+          <w:bCs/>
+        </w:rPr>
+        <w:t xml:space="preserve">Con las manos. </w:t>
+      </w:r>
+      <w:r>
+        <w:t xml:space="preserve">Arma esta posición en tu tablero. Prueba con tus piezas: haz la primera jugada, contesta por las negras y busca el mate.</w:t>
+      </w:r>
+    </w:p>
+    <w:p>
+      <w:pPr>
+        <w:keepNext/>
+        <w:keepLines/>
       </w:pPr>
       <w:r>
         <w:rPr>
@@ -5777,7 +6552,7 @@
       <w:r>
         <w:drawing>
           <wp:inline distT="0" distB="0" distL="0" distR="0">
-            <wp:extent cx="3887986" cy="3887986"/>
+            <wp:extent cx="3239988" cy="3239988"/>
             <wp:effectExtent t="0" r="0" b="0" l="0"/>
             <wp:docPr id="1" name="Dibujo decorativo" descr="" title="">
               <a:extLst xmlns:a="http://schemas.openxmlformats.org/drawingml/2006/main">
@@ -5808,7 +6583,7 @@
                   <pic:spPr bwMode="auto">
                     <a:xfrm>
                       <a:off x="0" y="0"/>
-                      <a:ext cx="3887986" cy="3887986"/>
+                      <a:ext cx="3239988" cy="3239988"/>
                     </a:xfrm>
                     <a:prstGeom prst="rect">
                       <a:avLst/>
@@ -5841,6 +6616,28 @@
       </w:r>
       <w:r>
         <w:t xml:space="preserve">Piezas blancas: rey en c6; torre en b1. Piezas negras: rey en a8.</w:t>
+      </w:r>
+    </w:p>
+    <w:p>
+      <w:pPr>
+        <w:keepNext/>
+        <w:keepLines/>
+        <w:pBdr>
+          <w:top w:val="single" w:color="000000" w:sz="12" w:space="6"/>
+          <w:left w:val="single" w:color="000000" w:sz="12" w:space="6"/>
+          <w:bottom w:val="single" w:color="000000" w:sz="12" w:space="6"/>
+          <w:right w:val="single" w:color="000000" w:sz="12" w:space="6"/>
+        </w:pBdr>
+      </w:pPr>
+      <w:r>
+        <w:rPr>
+          <w:b/>
+          <w:bCs/>
+        </w:rPr>
+        <w:t xml:space="preserve">Con las manos. </w:t>
+      </w:r>
+      <w:r>
+        <w:t xml:space="preserve">Arma esta posición en tu tablero. Prueba con tus piezas: haz la primera jugada, contesta por las negras y busca el mate.</w:t>
       </w:r>
     </w:p>
     <w:p>
@@ -6063,7 +6860,7 @@
       <w:r>
         <w:drawing>
           <wp:inline distT="0" distB="0" distL="0" distR="0">
-            <wp:extent cx="5399931" cy="5399931"/>
+            <wp:extent cx="4319885" cy="4319885"/>
             <wp:effectExtent t="0" r="0" b="0" l="0"/>
             <wp:docPr id="1" name="Dibujo decorativo" descr="" title="">
               <a:extLst xmlns:a="http://schemas.openxmlformats.org/drawingml/2006/main">
@@ -6094,7 +6891,7 @@
                   <pic:spPr bwMode="auto">
                     <a:xfrm>
                       <a:off x="0" y="0"/>
-                      <a:ext cx="5399931" cy="5399931"/>
+                      <a:ext cx="4319885" cy="4319885"/>
                     </a:xfrm>
                     <a:prstGeom prst="rect">
                       <a:avLst/>
@@ -6122,6 +6919,7 @@
     </w:p>
     <w:p>
       <w:pPr>
+        <w:keepNext/>
         <w:keepLines/>
         <w:pBdr>
           <w:top w:val="single" w:color="000000" w:sz="12" w:space="6"/>
@@ -6138,7 +6936,28 @@
         <w:t xml:space="preserve">La posición. </w:t>
       </w:r>
       <w:r>
-        <w:t xml:space="preserve">Piezas blancas: rey en c3; dama en g6. Piezas negras: rey en e1. La flecha va de g6 a g2.</w:t>
+        <w:t xml:space="preserve">Piezas blancas: rey en c3; dama en g6. Piezas negras: rey en e1.</w:t>
+      </w:r>
+    </w:p>
+    <w:p>
+      <w:pPr>
+        <w:keepLines/>
+        <w:pBdr>
+          <w:top w:val="single" w:color="000000" w:sz="12" w:space="6"/>
+          <w:left w:val="single" w:color="000000" w:sz="12" w:space="6"/>
+          <w:bottom w:val="single" w:color="000000" w:sz="12" w:space="6"/>
+          <w:right w:val="single" w:color="000000" w:sz="12" w:space="6"/>
+        </w:pBdr>
+      </w:pPr>
+      <w:r>
+        <w:rPr>
+          <w:b/>
+          <w:bCs/>
+        </w:rPr>
+        <w:t xml:space="preserve">Con las manos. </w:t>
+      </w:r>
+      <w:r>
+        <w:t xml:space="preserve">Arma esta posición en tu tablero. Con el dedo, sigue el camino de g6 a g2.</w:t>
       </w:r>
     </w:p>
     <w:p>
@@ -6222,7 +7041,7 @@
       <w:r>
         <w:drawing>
           <wp:inline distT="0" distB="0" distL="0" distR="0">
-            <wp:extent cx="3887986" cy="3887986"/>
+            <wp:extent cx="3239988" cy="3239988"/>
             <wp:effectExtent t="0" r="0" b="0" l="0"/>
             <wp:docPr id="1" name="Dibujo decorativo" descr="" title="">
               <a:extLst xmlns:a="http://schemas.openxmlformats.org/drawingml/2006/main">
@@ -6253,7 +7072,7 @@
                   <pic:spPr bwMode="auto">
                     <a:xfrm>
                       <a:off x="0" y="0"/>
-                      <a:ext cx="3887986" cy="3887986"/>
+                      <a:ext cx="3239988" cy="3239988"/>
                     </a:xfrm>
                     <a:prstGeom prst="rect">
                       <a:avLst/>
@@ -6292,6 +7111,28 @@
       <w:pPr>
         <w:keepNext/>
         <w:keepLines/>
+        <w:pBdr>
+          <w:top w:val="single" w:color="000000" w:sz="12" w:space="6"/>
+          <w:left w:val="single" w:color="000000" w:sz="12" w:space="6"/>
+          <w:bottom w:val="single" w:color="000000" w:sz="12" w:space="6"/>
+          <w:right w:val="single" w:color="000000" w:sz="12" w:space="6"/>
+        </w:pBdr>
+      </w:pPr>
+      <w:r>
+        <w:rPr>
+          <w:b/>
+          <w:bCs/>
+        </w:rPr>
+        <w:t xml:space="preserve">Con las manos. </w:t>
+      </w:r>
+      <w:r>
+        <w:t xml:space="preserve">Arma esta posición en tu tablero. Prueba con tus piezas: haz la primera jugada, contesta por las negras y busca el mate.</w:t>
+      </w:r>
+    </w:p>
+    <w:p>
+      <w:pPr>
+        <w:keepNext/>
+        <w:keepLines/>
       </w:pPr>
       <w:r>
         <w:rPr>
@@ -6339,7 +7180,7 @@
       <w:r>
         <w:drawing>
           <wp:inline distT="0" distB="0" distL="0" distR="0">
-            <wp:extent cx="3887986" cy="3887986"/>
+            <wp:extent cx="3239988" cy="3239988"/>
             <wp:effectExtent t="0" r="0" b="0" l="0"/>
             <wp:docPr id="1" name="Dibujo decorativo" descr="" title="">
               <a:extLst xmlns:a="http://schemas.openxmlformats.org/drawingml/2006/main">
@@ -6370,7 +7211,7 @@
                   <pic:spPr bwMode="auto">
                     <a:xfrm>
                       <a:off x="0" y="0"/>
-                      <a:ext cx="3887986" cy="3887986"/>
+                      <a:ext cx="3239988" cy="3239988"/>
                     </a:xfrm>
                     <a:prstGeom prst="rect">
                       <a:avLst/>
@@ -6409,6 +7250,28 @@
       <w:pPr>
         <w:keepNext/>
         <w:keepLines/>
+        <w:pBdr>
+          <w:top w:val="single" w:color="000000" w:sz="12" w:space="6"/>
+          <w:left w:val="single" w:color="000000" w:sz="12" w:space="6"/>
+          <w:bottom w:val="single" w:color="000000" w:sz="12" w:space="6"/>
+          <w:right w:val="single" w:color="000000" w:sz="12" w:space="6"/>
+        </w:pBdr>
+      </w:pPr>
+      <w:r>
+        <w:rPr>
+          <w:b/>
+          <w:bCs/>
+        </w:rPr>
+        <w:t xml:space="preserve">Con las manos. </w:t>
+      </w:r>
+      <w:r>
+        <w:t xml:space="preserve">Arma esta posición en tu tablero. Prueba con tus piezas: haz la primera jugada, contesta por las negras y busca el mate.</w:t>
+      </w:r>
+    </w:p>
+    <w:p>
+      <w:pPr>
+        <w:keepNext/>
+        <w:keepLines/>
       </w:pPr>
       <w:r>
         <w:rPr>
@@ -6456,7 +7319,7 @@
       <w:r>
         <w:drawing>
           <wp:inline distT="0" distB="0" distL="0" distR="0">
-            <wp:extent cx="3887986" cy="3887986"/>
+            <wp:extent cx="3239988" cy="3239988"/>
             <wp:effectExtent t="0" r="0" b="0" l="0"/>
             <wp:docPr id="1" name="Dibujo decorativo" descr="" title="">
               <a:extLst xmlns:a="http://schemas.openxmlformats.org/drawingml/2006/main">
@@ -6487,7 +7350,7 @@
                   <pic:spPr bwMode="auto">
                     <a:xfrm>
                       <a:off x="0" y="0"/>
-                      <a:ext cx="3887986" cy="3887986"/>
+                      <a:ext cx="3239988" cy="3239988"/>
                     </a:xfrm>
                     <a:prstGeom prst="rect">
                       <a:avLst/>
@@ -6520,6 +7383,28 @@
       </w:r>
       <w:r>
         <w:t xml:space="preserve">Piezas blancas: rey en c4; dama en f8. Piezas negras: rey en a1.</w:t>
+      </w:r>
+    </w:p>
+    <w:p>
+      <w:pPr>
+        <w:keepNext/>
+        <w:keepLines/>
+        <w:pBdr>
+          <w:top w:val="single" w:color="000000" w:sz="12" w:space="6"/>
+          <w:left w:val="single" w:color="000000" w:sz="12" w:space="6"/>
+          <w:bottom w:val="single" w:color="000000" w:sz="12" w:space="6"/>
+          <w:right w:val="single" w:color="000000" w:sz="12" w:space="6"/>
+        </w:pBdr>
+      </w:pPr>
+      <w:r>
+        <w:rPr>
+          <w:b/>
+          <w:bCs/>
+        </w:rPr>
+        <w:t xml:space="preserve">Con las manos. </w:t>
+      </w:r>
+      <w:r>
+        <w:t xml:space="preserve">Arma esta posición en tu tablero. Prueba con tus piezas: haz la primera jugada, contesta por las negras y busca el mate.</w:t>
       </w:r>
     </w:p>
     <w:p>
@@ -6827,7 +7712,7 @@
       <w:r>
         <w:drawing>
           <wp:inline distT="0" distB="0" distL="0" distR="0">
-            <wp:extent cx="3887986" cy="3887986"/>
+            <wp:extent cx="3239988" cy="3239988"/>
             <wp:effectExtent t="0" r="0" b="0" l="0"/>
             <wp:docPr id="1" name="Dibujo decorativo" descr="" title="">
               <a:extLst xmlns:a="http://schemas.openxmlformats.org/drawingml/2006/main">
@@ -6858,7 +7743,7 @@
                   <pic:spPr bwMode="auto">
                     <a:xfrm>
                       <a:off x="0" y="0"/>
-                      <a:ext cx="3887986" cy="3887986"/>
+                      <a:ext cx="3239988" cy="3239988"/>
                     </a:xfrm>
                     <a:prstGeom prst="rect">
                       <a:avLst/>
@@ -6897,6 +7782,28 @@
       <w:pPr>
         <w:keepNext/>
         <w:keepLines/>
+        <w:pBdr>
+          <w:top w:val="single" w:color="000000" w:sz="12" w:space="6"/>
+          <w:left w:val="single" w:color="000000" w:sz="12" w:space="6"/>
+          <w:bottom w:val="single" w:color="000000" w:sz="12" w:space="6"/>
+          <w:right w:val="single" w:color="000000" w:sz="12" w:space="6"/>
+        </w:pBdr>
+      </w:pPr>
+      <w:r>
+        <w:rPr>
+          <w:b/>
+          <w:bCs/>
+        </w:rPr>
+        <w:t xml:space="preserve">Con las manos. </w:t>
+      </w:r>
+      <w:r>
+        <w:t xml:space="preserve">Arma esta posición en tu tablero. Prueba con tus piezas las jugadas de las blancas. Después de cada una, toca las casillas de alrededor del rey negro: ¿puede escapar a alguna?</w:t>
+      </w:r>
+    </w:p>
+    <w:p>
+      <w:pPr>
+        <w:keepNext/>
+        <w:keepLines/>
       </w:pPr>
       <w:r>
         <w:rPr>
@@ -6944,7 +7851,7 @@
       <w:r>
         <w:drawing>
           <wp:inline distT="0" distB="0" distL="0" distR="0">
-            <wp:extent cx="3887986" cy="3887986"/>
+            <wp:extent cx="3239988" cy="3239988"/>
             <wp:effectExtent t="0" r="0" b="0" l="0"/>
             <wp:docPr id="1" name="Dibujo decorativo" descr="" title="">
               <a:extLst xmlns:a="http://schemas.openxmlformats.org/drawingml/2006/main">
@@ -6975,7 +7882,7 @@
                   <pic:spPr bwMode="auto">
                     <a:xfrm>
                       <a:off x="0" y="0"/>
-                      <a:ext cx="3887986" cy="3887986"/>
+                      <a:ext cx="3239988" cy="3239988"/>
                     </a:xfrm>
                     <a:prstGeom prst="rect">
                       <a:avLst/>
@@ -7014,6 +7921,28 @@
       <w:pPr>
         <w:keepNext/>
         <w:keepLines/>
+        <w:pBdr>
+          <w:top w:val="single" w:color="000000" w:sz="12" w:space="6"/>
+          <w:left w:val="single" w:color="000000" w:sz="12" w:space="6"/>
+          <w:bottom w:val="single" w:color="000000" w:sz="12" w:space="6"/>
+          <w:right w:val="single" w:color="000000" w:sz="12" w:space="6"/>
+        </w:pBdr>
+      </w:pPr>
+      <w:r>
+        <w:rPr>
+          <w:b/>
+          <w:bCs/>
+        </w:rPr>
+        <w:t xml:space="preserve">Con las manos. </w:t>
+      </w:r>
+      <w:r>
+        <w:t xml:space="preserve">Arma esta posición en tu tablero. Prueba con tus piezas las jugadas de las blancas. Después de cada una, toca las casillas de alrededor del rey negro: ¿puede escapar a alguna?</w:t>
+      </w:r>
+    </w:p>
+    <w:p>
+      <w:pPr>
+        <w:keepNext/>
+        <w:keepLines/>
       </w:pPr>
       <w:r>
         <w:rPr>
@@ -7061,7 +7990,7 @@
       <w:r>
         <w:drawing>
           <wp:inline distT="0" distB="0" distL="0" distR="0">
-            <wp:extent cx="3887986" cy="3887986"/>
+            <wp:extent cx="3239988" cy="3239988"/>
             <wp:effectExtent t="0" r="0" b="0" l="0"/>
             <wp:docPr id="1" name="Dibujo decorativo" descr="" title="">
               <a:extLst xmlns:a="http://schemas.openxmlformats.org/drawingml/2006/main">
@@ -7092,7 +8021,7 @@
                   <pic:spPr bwMode="auto">
                     <a:xfrm>
                       <a:off x="0" y="0"/>
-                      <a:ext cx="3887986" cy="3887986"/>
+                      <a:ext cx="3239988" cy="3239988"/>
                     </a:xfrm>
                     <a:prstGeom prst="rect">
                       <a:avLst/>
@@ -7131,13 +8060,35 @@
       <w:pPr>
         <w:keepNext/>
         <w:keepLines/>
-      </w:pPr>
-      <w:r>
-        <w:rPr>
-          <w:b/>
-          <w:bCs/>
-        </w:rPr>
-        <w:t xml:space="preserve">Le toca mover al rey negro. ¿Qué pasó? ¿Jaque mate, ahogado o ninguno?</w:t>
+        <w:pBdr>
+          <w:top w:val="single" w:color="000000" w:sz="12" w:space="6"/>
+          <w:left w:val="single" w:color="000000" w:sz="12" w:space="6"/>
+          <w:bottom w:val="single" w:color="000000" w:sz="12" w:space="6"/>
+          <w:right w:val="single" w:color="000000" w:sz="12" w:space="6"/>
+        </w:pBdr>
+      </w:pPr>
+      <w:r>
+        <w:rPr>
+          <w:b/>
+          <w:bCs/>
+        </w:rPr>
+        <w:t xml:space="preserve">Con las manos. </w:t>
+      </w:r>
+      <w:r>
+        <w:t xml:space="preserve">Arma esta posición en tu tablero. Toca, una por una, las casillas de alrededor del rey negro. Para cada una, busca si alguna pieza blanca llega hasta ahí.</w:t>
+      </w:r>
+    </w:p>
+    <w:p>
+      <w:pPr>
+        <w:keepNext/>
+        <w:keepLines/>
+      </w:pPr>
+      <w:r>
+        <w:rPr>
+          <w:b/>
+          <w:bCs/>
+        </w:rPr>
+        <w:t xml:space="preserve">Le toca mover al rey negro. ¿Qué pasó: jaque mate, ahogado o ninguno?</w:t>
       </w:r>
     </w:p>
     <w:p>
@@ -7178,7 +8129,7 @@
       <w:r>
         <w:drawing>
           <wp:inline distT="0" distB="0" distL="0" distR="0">
-            <wp:extent cx="3887986" cy="3887986"/>
+            <wp:extent cx="3239988" cy="3239988"/>
             <wp:effectExtent t="0" r="0" b="0" l="0"/>
             <wp:docPr id="1" name="Dibujo decorativo" descr="" title="">
               <a:extLst xmlns:a="http://schemas.openxmlformats.org/drawingml/2006/main">
@@ -7209,7 +8160,7 @@
                   <pic:spPr bwMode="auto">
                     <a:xfrm>
                       <a:off x="0" y="0"/>
-                      <a:ext cx="3887986" cy="3887986"/>
+                      <a:ext cx="3239988" cy="3239988"/>
                     </a:xfrm>
                     <a:prstGeom prst="rect">
                       <a:avLst/>
@@ -7242,6 +8193,28 @@
       </w:r>
       <w:r>
         <w:t xml:space="preserve">Piezas blancas: rey en d6; dama en h3. Piezas negras: rey en a4.</w:t>
+      </w:r>
+    </w:p>
+    <w:p>
+      <w:pPr>
+        <w:keepNext/>
+        <w:keepLines/>
+        <w:pBdr>
+          <w:top w:val="single" w:color="000000" w:sz="12" w:space="6"/>
+          <w:left w:val="single" w:color="000000" w:sz="12" w:space="6"/>
+          <w:bottom w:val="single" w:color="000000" w:sz="12" w:space="6"/>
+          <w:right w:val="single" w:color="000000" w:sz="12" w:space="6"/>
+        </w:pBdr>
+      </w:pPr>
+      <w:r>
+        <w:rPr>
+          <w:b/>
+          <w:bCs/>
+        </w:rPr>
+        <w:t xml:space="preserve">Con las manos. </w:t>
+      </w:r>
+      <w:r>
+        <w:t xml:space="preserve">Arma esta posición en tu tablero. Prueba con tus piezas: haz la primera jugada, contesta por las negras y busca el mate.</w:t>
       </w:r>
     </w:p>
     <w:p>

</xml_diff>